<commit_message>
fix all issues for docx shifa and makkiyyah
</commit_message>
<xml_diff>
--- a/publishing/addawatul-makkiyyah-english/exports/docx/addawatul-makkiyyah-english.docx
+++ b/publishing/addawatul-makkiyyah-english/exports/docx/addawatul-makkiyyah-english.docx
@@ -53,6 +53,7 @@
           <w:sz w:val="22"/>
           <w:szCs w:val="22"/>
           <w:vertAlign w:val="superscript"/>
+          <w:rtl/>
         </w:rPr>
         <w:t xml:space="preserve">رحمة الله تعالى عليه</w:t>
       </w:r>
@@ -178,6 +179,7 @@
           <w:sz w:val="16"/>
           <w:szCs w:val="16"/>
           <w:vertAlign w:val="superscript"/>
+          <w:rtl/>
         </w:rPr>
         <w:t xml:space="preserve">رحمة الله تعالى عليه</w:t>
       </w:r>
@@ -360,6 +362,7 @@
           <w:rFonts w:ascii="Noto Naskh Arabic" w:cs="Noto Naskh Arabic" w:eastAsia="Noto Naskh Arabic" w:hAnsi="Noto Naskh Arabic"/>
           <w:sz w:val="22"/>
           <w:szCs w:val="22"/>
+          <w:rtl/>
         </w:rPr>
         <w:t xml:space="preserve">ﷺ</w:t>
       </w:r>
@@ -391,6 +394,7 @@
           <w:sz w:val="16"/>
           <w:szCs w:val="16"/>
           <w:vertAlign w:val="superscript"/>
+          <w:rtl/>
         </w:rPr>
         <w:t xml:space="preserve">رحمة الله تعالى عليه</w:t>
       </w:r>
@@ -421,6 +425,7 @@
           <w:rFonts w:ascii="Noto Naskh Arabic" w:cs="Noto Naskh Arabic" w:eastAsia="Noto Naskh Arabic" w:hAnsi="Noto Naskh Arabic"/>
           <w:sz w:val="22"/>
           <w:szCs w:val="22"/>
+          <w:rtl/>
         </w:rPr>
         <w:t xml:space="preserve">ﷺ</w:t>
       </w:r>
@@ -474,6 +479,7 @@
           <w:sz w:val="16"/>
           <w:szCs w:val="16"/>
           <w:vertAlign w:val="superscript"/>
+          <w:rtl/>
         </w:rPr>
         <w:t xml:space="preserve">رحمة الله تعالى عليه</w:t>
       </w:r>
@@ -618,6 +624,7 @@
           <w:rFonts w:ascii="Noto Naskh Arabic" w:cs="Noto Naskh Arabic" w:eastAsia="Noto Naskh Arabic" w:hAnsi="Noto Naskh Arabic"/>
           <w:sz w:val="22"/>
           <w:szCs w:val="22"/>
+          <w:rtl/>
         </w:rPr>
         <w:t xml:space="preserve">ﷺ</w:t>
       </w:r>
@@ -648,6 +655,7 @@
           <w:rFonts w:ascii="Noto Naskh Arabic" w:cs="Noto Naskh Arabic" w:eastAsia="Noto Naskh Arabic" w:hAnsi="Noto Naskh Arabic"/>
           <w:sz w:val="22"/>
           <w:szCs w:val="22"/>
+          <w:rtl/>
         </w:rPr>
         <w:t xml:space="preserve">ﷺ</w:t>
       </w:r>
@@ -697,6 +705,7 @@
           <w:sz w:val="16"/>
           <w:szCs w:val="16"/>
           <w:vertAlign w:val="superscript"/>
+          <w:rtl/>
         </w:rPr>
         <w:t xml:space="preserve">عليه السلام</w:t>
       </w:r>
@@ -713,6 +722,7 @@
           <w:rFonts w:ascii="Noto Naskh Arabic" w:cs="Noto Naskh Arabic" w:eastAsia="Noto Naskh Arabic" w:hAnsi="Noto Naskh Arabic"/>
           <w:sz w:val="22"/>
           <w:szCs w:val="22"/>
+          <w:rtl/>
         </w:rPr>
         <w:t xml:space="preserve">ﷺ</w:t>
       </w:r>
@@ -729,6 +739,7 @@
           <w:rFonts w:ascii="Noto Naskh Arabic" w:cs="Noto Naskh Arabic" w:eastAsia="Noto Naskh Arabic" w:hAnsi="Noto Naskh Arabic"/>
           <w:sz w:val="22"/>
           <w:szCs w:val="22"/>
+          <w:rtl/>
         </w:rPr>
         <w:t xml:space="preserve">ﷺ</w:t>
       </w:r>
@@ -759,6 +770,7 @@
           <w:rFonts w:ascii="Noto Naskh Arabic" w:cs="Noto Naskh Arabic" w:eastAsia="Noto Naskh Arabic" w:hAnsi="Noto Naskh Arabic"/>
           <w:sz w:val="22"/>
           <w:szCs w:val="22"/>
+          <w:rtl/>
         </w:rPr>
         <w:t xml:space="preserve">ﷺ</w:t>
       </w:r>
@@ -775,6 +787,7 @@
           <w:rFonts w:ascii="Noto Naskh Arabic" w:cs="Noto Naskh Arabic" w:eastAsia="Noto Naskh Arabic" w:hAnsi="Noto Naskh Arabic"/>
           <w:sz w:val="22"/>
           <w:szCs w:val="22"/>
+          <w:rtl/>
         </w:rPr>
         <w:t xml:space="preserve">ﷺ</w:t>
       </w:r>
@@ -791,6 +804,7 @@
           <w:rFonts w:ascii="Noto Naskh Arabic" w:cs="Noto Naskh Arabic" w:eastAsia="Noto Naskh Arabic" w:hAnsi="Noto Naskh Arabic"/>
           <w:sz w:val="22"/>
           <w:szCs w:val="22"/>
+          <w:rtl/>
         </w:rPr>
         <w:t xml:space="preserve">ﷺ</w:t>
       </w:r>
@@ -807,6 +821,7 @@
           <w:rFonts w:ascii="Noto Naskh Arabic" w:cs="Noto Naskh Arabic" w:eastAsia="Noto Naskh Arabic" w:hAnsi="Noto Naskh Arabic"/>
           <w:sz w:val="22"/>
           <w:szCs w:val="22"/>
+          <w:rtl/>
         </w:rPr>
         <w:t xml:space="preserve">ﷺ</w:t>
       </w:r>
@@ -845,6 +860,7 @@
           <w:rFonts w:ascii="Noto Naskh Arabic" w:cs="Noto Naskh Arabic" w:eastAsia="Noto Naskh Arabic" w:hAnsi="Noto Naskh Arabic"/>
           <w:sz w:val="22"/>
           <w:szCs w:val="22"/>
+          <w:rtl/>
         </w:rPr>
         <w:t xml:space="preserve">ﷺ</w:t>
       </w:r>
@@ -889,6 +905,7 @@
           <w:rFonts w:ascii="Noto Naskh Arabic" w:cs="Noto Naskh Arabic" w:eastAsia="Noto Naskh Arabic" w:hAnsi="Noto Naskh Arabic"/>
           <w:sz w:val="22"/>
           <w:szCs w:val="22"/>
+          <w:rtl/>
         </w:rPr>
         <w:t xml:space="preserve">ﷺ</w:t>
       </w:r>
@@ -933,6 +950,7 @@
           <w:rFonts w:ascii="Noto Naskh Arabic" w:cs="Noto Naskh Arabic" w:eastAsia="Noto Naskh Arabic" w:hAnsi="Noto Naskh Arabic"/>
           <w:sz w:val="22"/>
           <w:szCs w:val="22"/>
+          <w:rtl/>
         </w:rPr>
         <w:t xml:space="preserve">ﷺ</w:t>
       </w:r>
@@ -963,6 +981,7 @@
           <w:rFonts w:ascii="Noto Naskh Arabic" w:cs="Noto Naskh Arabic" w:eastAsia="Noto Naskh Arabic" w:hAnsi="Noto Naskh Arabic"/>
           <w:sz w:val="22"/>
           <w:szCs w:val="22"/>
+          <w:rtl/>
         </w:rPr>
         <w:t xml:space="preserve">ﷺ</w:t>
       </w:r>
@@ -1855,6 +1874,7 @@
           <w:sz w:val="16"/>
           <w:szCs w:val="16"/>
           <w:vertAlign w:val="superscript"/>
+          <w:rtl/>
         </w:rPr>
         <w:t xml:space="preserve">قدس سره</w:t>
       </w:r>
@@ -1875,6 +1895,7 @@
           <w:iCs/>
           <w:sz w:val="22"/>
           <w:szCs w:val="22"/>
+          <w:rtl/>
         </w:rPr>
         <w:t xml:space="preserve">"الرشاد لقمع مبانی الفساد"</w:t>
       </w:r>
@@ -2341,6 +2362,7 @@
           <w:sz w:val="26"/>
           <w:szCs w:val="26"/>
           <w:vertAlign w:val="superscript"/>
+          <w:rtl/>
         </w:rPr>
         <w:t xml:space="preserve">عليهما السلام</w:t>
       </w:r>
@@ -2378,6 +2400,7 @@
           <w:sz w:val="16"/>
           <w:szCs w:val="16"/>
           <w:vertAlign w:val="superscript"/>
+          <w:rtl/>
         </w:rPr>
         <w:t xml:space="preserve">عليه السلام</w:t>
       </w:r>
@@ -2395,6 +2418,7 @@
           <w:sz w:val="16"/>
           <w:szCs w:val="16"/>
           <w:vertAlign w:val="superscript"/>
+          <w:rtl/>
         </w:rPr>
         <w:t xml:space="preserve">عليه السلام</w:t>
       </w:r>
@@ -3036,6 +3060,7 @@
           <w:sz w:val="16"/>
           <w:szCs w:val="16"/>
           <w:vertAlign w:val="superscript"/>
+          <w:rtl/>
         </w:rPr>
         <w:t xml:space="preserve">عليه السلام</w:t>
       </w:r>
@@ -3134,6 +3159,7 @@
           <w:sz w:val="16"/>
           <w:szCs w:val="16"/>
           <w:vertAlign w:val="superscript"/>
+          <w:rtl/>
         </w:rPr>
         <w:t xml:space="preserve">رحمة الله تعالى عليه</w:t>
       </w:r>
@@ -3151,6 +3177,7 @@
           <w:sz w:val="16"/>
           <w:szCs w:val="16"/>
           <w:vertAlign w:val="superscript"/>
+          <w:rtl/>
         </w:rPr>
         <w:t xml:space="preserve">رحمة الله تعالى عليه</w:t>
       </w:r>
@@ -3257,6 +3284,7 @@
           <w:rFonts w:ascii="Noto Naskh Arabic" w:cs="Noto Naskh Arabic" w:eastAsia="Noto Naskh Arabic" w:hAnsi="Noto Naskh Arabic"/>
           <w:sz w:val="22"/>
           <w:szCs w:val="22"/>
+          <w:rtl/>
         </w:rPr>
         <w:t xml:space="preserve">ﷺ</w:t>
       </w:r>
@@ -3273,6 +3301,7 @@
           <w:rFonts w:ascii="Noto Naskh Arabic" w:cs="Noto Naskh Arabic" w:eastAsia="Noto Naskh Arabic" w:hAnsi="Noto Naskh Arabic"/>
           <w:sz w:val="22"/>
           <w:szCs w:val="22"/>
+          <w:rtl/>
         </w:rPr>
         <w:t xml:space="preserve">ﷺ</w:t>
       </w:r>
@@ -3316,6 +3345,7 @@
           <w:iCs/>
           <w:sz w:val="22"/>
           <w:szCs w:val="22"/>
+          <w:rtl/>
         </w:rPr>
         <w:t xml:space="preserve">"انباء المصطفى بحال سر و اخفى"</w:t>
       </w:r>
@@ -3352,6 +3382,7 @@
           <w:rFonts w:ascii="Noto Naskh Arabic" w:cs="Noto Naskh Arabic" w:eastAsia="Noto Naskh Arabic" w:hAnsi="Noto Naskh Arabic"/>
           <w:sz w:val="22"/>
           <w:szCs w:val="22"/>
+          <w:rtl/>
         </w:rPr>
         <w:t xml:space="preserve">ﷺ</w:t>
       </w:r>
@@ -3368,6 +3399,7 @@
           <w:rFonts w:ascii="Noto Naskh Arabic" w:cs="Noto Naskh Arabic" w:eastAsia="Noto Naskh Arabic" w:hAnsi="Noto Naskh Arabic"/>
           <w:sz w:val="22"/>
           <w:szCs w:val="22"/>
+          <w:rtl/>
         </w:rPr>
         <w:t xml:space="preserve">ﷺ</w:t>
       </w:r>
@@ -3666,6 +3698,7 @@
           <w:rFonts w:ascii="Noto Naskh Arabic" w:cs="Noto Naskh Arabic" w:eastAsia="Noto Naskh Arabic" w:hAnsi="Noto Naskh Arabic"/>
           <w:sz w:val="22"/>
           <w:szCs w:val="22"/>
+          <w:rtl/>
         </w:rPr>
         <w:t xml:space="preserve">ﷺ</w:t>
       </w:r>
@@ -4062,6 +4095,7 @@
           <w:rFonts w:ascii="Noto Naskh Arabic" w:cs="Noto Naskh Arabic" w:eastAsia="Noto Naskh Arabic" w:hAnsi="Noto Naskh Arabic"/>
           <w:sz w:val="22"/>
           <w:szCs w:val="22"/>
+          <w:rtl/>
         </w:rPr>
         <w:t xml:space="preserve">ﷺ</w:t>
       </w:r>
@@ -4092,6 +4126,7 @@
           <w:rFonts w:ascii="Noto Naskh Arabic" w:cs="Noto Naskh Arabic" w:eastAsia="Noto Naskh Arabic" w:hAnsi="Noto Naskh Arabic"/>
           <w:sz w:val="22"/>
           <w:szCs w:val="22"/>
+          <w:rtl/>
         </w:rPr>
         <w:t xml:space="preserve">ﷺ</w:t>
       </w:r>
@@ -4154,6 +4189,7 @@
           <w:rFonts w:ascii="Noto Naskh Arabic" w:cs="Noto Naskh Arabic" w:eastAsia="Noto Naskh Arabic" w:hAnsi="Noto Naskh Arabic"/>
           <w:sz w:val="22"/>
           <w:szCs w:val="22"/>
+          <w:rtl/>
         </w:rPr>
         <w:t xml:space="preserve">ﷺ</w:t>
       </w:r>
@@ -4170,6 +4206,7 @@
           <w:rFonts w:ascii="Noto Naskh Arabic" w:cs="Noto Naskh Arabic" w:eastAsia="Noto Naskh Arabic" w:hAnsi="Noto Naskh Arabic"/>
           <w:sz w:val="22"/>
           <w:szCs w:val="22"/>
+          <w:rtl/>
         </w:rPr>
         <w:t xml:space="preserve">ﷺ</w:t>
       </w:r>
@@ -4286,6 +4323,7 @@
           <w:rFonts w:ascii="Noto Naskh Arabic" w:cs="Noto Naskh Arabic" w:eastAsia="Noto Naskh Arabic" w:hAnsi="Noto Naskh Arabic"/>
           <w:sz w:val="22"/>
           <w:szCs w:val="22"/>
+          <w:rtl/>
         </w:rPr>
         <w:t xml:space="preserve">ﷺ</w:t>
       </w:r>
@@ -4363,6 +4401,7 @@
           <w:sz w:val="16"/>
           <w:szCs w:val="16"/>
           <w:vertAlign w:val="superscript"/>
+          <w:rtl/>
         </w:rPr>
         <w:t xml:space="preserve">عليهم السلام</w:t>
       </w:r>
@@ -4393,6 +4432,7 @@
           <w:rFonts w:ascii="Noto Naskh Arabic" w:cs="Noto Naskh Arabic" w:eastAsia="Noto Naskh Arabic" w:hAnsi="Noto Naskh Arabic"/>
           <w:sz w:val="22"/>
           <w:szCs w:val="22"/>
+          <w:rtl/>
         </w:rPr>
         <w:t xml:space="preserve">ﷺ</w:t>
       </w:r>
@@ -4409,6 +4449,7 @@
           <w:rFonts w:ascii="Noto Naskh Arabic" w:cs="Noto Naskh Arabic" w:eastAsia="Noto Naskh Arabic" w:hAnsi="Noto Naskh Arabic"/>
           <w:sz w:val="22"/>
           <w:szCs w:val="22"/>
+          <w:rtl/>
         </w:rPr>
         <w:t xml:space="preserve">ﷺ</w:t>
       </w:r>
@@ -4541,6 +4582,7 @@
           <w:sz w:val="16"/>
           <w:szCs w:val="16"/>
           <w:vertAlign w:val="superscript"/>
+          <w:rtl/>
         </w:rPr>
         <w:t xml:space="preserve">عليهم السلام</w:t>
       </w:r>
@@ -4742,6 +4784,7 @@
           <w:sz w:val="16"/>
           <w:szCs w:val="16"/>
           <w:vertAlign w:val="superscript"/>
+          <w:rtl/>
         </w:rPr>
         <w:t xml:space="preserve">رضي الله تعالى عنهما</w:t>
       </w:r>
@@ -4758,6 +4801,7 @@
           <w:rFonts w:ascii="Noto Naskh Arabic" w:cs="Noto Naskh Arabic" w:eastAsia="Noto Naskh Arabic" w:hAnsi="Noto Naskh Arabic"/>
           <w:sz w:val="22"/>
           <w:szCs w:val="22"/>
+          <w:rtl/>
         </w:rPr>
         <w:t xml:space="preserve">ﷺ</w:t>
       </w:r>
@@ -4857,6 +4901,7 @@
           <w:rFonts w:ascii="Noto Naskh Arabic" w:cs="Noto Naskh Arabic" w:eastAsia="Noto Naskh Arabic" w:hAnsi="Noto Naskh Arabic"/>
           <w:sz w:val="22"/>
           <w:szCs w:val="22"/>
+          <w:rtl/>
         </w:rPr>
         <w:t xml:space="preserve">ﷺ</w:t>
       </w:r>
@@ -4873,6 +4918,7 @@
           <w:rFonts w:ascii="Noto Naskh Arabic" w:cs="Noto Naskh Arabic" w:eastAsia="Noto Naskh Arabic" w:hAnsi="Noto Naskh Arabic"/>
           <w:sz w:val="22"/>
           <w:szCs w:val="22"/>
+          <w:rtl/>
         </w:rPr>
         <w:t xml:space="preserve">ﷺ</w:t>
       </w:r>
@@ -4935,6 +4981,7 @@
           <w:rFonts w:ascii="Noto Naskh Arabic" w:cs="Noto Naskh Arabic" w:eastAsia="Noto Naskh Arabic" w:hAnsi="Noto Naskh Arabic"/>
           <w:sz w:val="22"/>
           <w:szCs w:val="22"/>
+          <w:rtl/>
         </w:rPr>
         <w:t xml:space="preserve">ﷺ</w:t>
       </w:r>
@@ -5131,6 +5178,7 @@
           <w:rFonts w:ascii="Noto Naskh Arabic" w:cs="Noto Naskh Arabic" w:eastAsia="Noto Naskh Arabic" w:hAnsi="Noto Naskh Arabic"/>
           <w:sz w:val="22"/>
           <w:szCs w:val="22"/>
+          <w:rtl/>
         </w:rPr>
         <w:t xml:space="preserve">ﷺ</w:t>
       </w:r>
@@ -5148,6 +5196,7 @@
           <w:sz w:val="16"/>
           <w:szCs w:val="16"/>
           <w:vertAlign w:val="superscript"/>
+          <w:rtl/>
         </w:rPr>
         <w:t xml:space="preserve">عليهم السلام</w:t>
       </w:r>
@@ -5165,6 +5214,7 @@
           <w:sz w:val="16"/>
           <w:szCs w:val="16"/>
           <w:vertAlign w:val="superscript"/>
+          <w:rtl/>
         </w:rPr>
         <w:t xml:space="preserve">رحمة الله تعالى عليهم</w:t>
       </w:r>
@@ -5329,6 +5379,7 @@
           <w:rFonts w:ascii="Noto Naskh Arabic" w:cs="Noto Naskh Arabic" w:eastAsia="Noto Naskh Arabic" w:hAnsi="Noto Naskh Arabic"/>
           <w:sz w:val="22"/>
           <w:szCs w:val="22"/>
+          <w:rtl/>
         </w:rPr>
         <w:t xml:space="preserve">ﷺ</w:t>
       </w:r>
@@ -5360,6 +5411,7 @@
           <w:sz w:val="16"/>
           <w:szCs w:val="16"/>
           <w:vertAlign w:val="superscript"/>
+          <w:rtl/>
         </w:rPr>
         <w:t xml:space="preserve">رحمة الله تعالى عليه</w:t>
       </w:r>
@@ -5463,6 +5515,7 @@
           <w:rFonts w:ascii="Noto Naskh Arabic" w:cs="Noto Naskh Arabic" w:eastAsia="Noto Naskh Arabic" w:hAnsi="Noto Naskh Arabic"/>
           <w:sz w:val="22"/>
           <w:szCs w:val="22"/>
+          <w:rtl/>
         </w:rPr>
         <w:t xml:space="preserve">ﷺ</w:t>
       </w:r>
@@ -5514,6 +5567,7 @@
           <w:iCs/>
           <w:sz w:val="22"/>
           <w:szCs w:val="22"/>
+          <w:rtl/>
         </w:rPr>
         <w:t xml:space="preserve">ﷺ</w:t>
       </w:r>
@@ -5669,6 +5723,7 @@
           <w:iCs/>
           <w:sz w:val="22"/>
           <w:szCs w:val="22"/>
+          <w:rtl/>
         </w:rPr>
         <w:t xml:space="preserve">ﷺ</w:t>
       </w:r>
@@ -5701,6 +5756,7 @@
           <w:rFonts w:ascii="Noto Naskh Arabic" w:cs="Noto Naskh Arabic" w:eastAsia="Noto Naskh Arabic" w:hAnsi="Noto Naskh Arabic"/>
           <w:sz w:val="22"/>
           <w:szCs w:val="22"/>
+          <w:rtl/>
         </w:rPr>
         <w:t xml:space="preserve">ﷺ</w:t>
       </w:r>
@@ -5718,6 +5774,7 @@
           <w:sz w:val="16"/>
           <w:szCs w:val="16"/>
           <w:vertAlign w:val="superscript"/>
+          <w:rtl/>
         </w:rPr>
         <w:t xml:space="preserve">رحمة الله تعالى عليه</w:t>
       </w:r>
@@ -5799,6 +5856,7 @@
           <w:rFonts w:ascii="Noto Naskh Arabic" w:cs="Noto Naskh Arabic" w:eastAsia="Noto Naskh Arabic" w:hAnsi="Noto Naskh Arabic"/>
           <w:sz w:val="22"/>
           <w:szCs w:val="22"/>
+          <w:rtl/>
         </w:rPr>
         <w:t xml:space="preserve">ﷺ</w:t>
       </w:r>
@@ -5829,6 +5887,7 @@
           <w:rFonts w:ascii="Noto Naskh Arabic" w:cs="Noto Naskh Arabic" w:eastAsia="Noto Naskh Arabic" w:hAnsi="Noto Naskh Arabic"/>
           <w:sz w:val="22"/>
           <w:szCs w:val="22"/>
+          <w:rtl/>
         </w:rPr>
         <w:t xml:space="preserve">ﷺ</w:t>
       </w:r>
@@ -5845,6 +5904,7 @@
           <w:rFonts w:ascii="Noto Naskh Arabic" w:cs="Noto Naskh Arabic" w:eastAsia="Noto Naskh Arabic" w:hAnsi="Noto Naskh Arabic"/>
           <w:sz w:val="22"/>
           <w:szCs w:val="22"/>
+          <w:rtl/>
         </w:rPr>
         <w:t xml:space="preserve">ﷺ</w:t>
       </w:r>
@@ -5875,6 +5935,7 @@
           <w:rFonts w:ascii="Noto Naskh Arabic" w:cs="Noto Naskh Arabic" w:eastAsia="Noto Naskh Arabic" w:hAnsi="Noto Naskh Arabic"/>
           <w:sz w:val="22"/>
           <w:szCs w:val="22"/>
+          <w:rtl/>
         </w:rPr>
         <w:t xml:space="preserve">ﷺ</w:t>
       </w:r>
@@ -5924,6 +5985,7 @@
           <w:rFonts w:ascii="Noto Naskh Arabic" w:cs="Noto Naskh Arabic" w:eastAsia="Noto Naskh Arabic" w:hAnsi="Noto Naskh Arabic"/>
           <w:sz w:val="22"/>
           <w:szCs w:val="22"/>
+          <w:rtl/>
         </w:rPr>
         <w:t xml:space="preserve">ﷺ</w:t>
       </w:r>
@@ -5954,6 +6016,7 @@
           <w:rFonts w:ascii="Noto Naskh Arabic" w:cs="Noto Naskh Arabic" w:eastAsia="Noto Naskh Arabic" w:hAnsi="Noto Naskh Arabic"/>
           <w:sz w:val="22"/>
           <w:szCs w:val="22"/>
+          <w:rtl/>
         </w:rPr>
         <w:t xml:space="preserve">ﷺ</w:t>
       </w:r>
@@ -5984,6 +6047,7 @@
           <w:rFonts w:ascii="Noto Naskh Arabic" w:cs="Noto Naskh Arabic" w:eastAsia="Noto Naskh Arabic" w:hAnsi="Noto Naskh Arabic"/>
           <w:sz w:val="22"/>
           <w:szCs w:val="22"/>
+          <w:rtl/>
         </w:rPr>
         <w:t xml:space="preserve">ﷺ</w:t>
       </w:r>
@@ -6119,6 +6183,7 @@
           <w:rFonts w:ascii="Noto Naskh Arabic" w:cs="Noto Naskh Arabic" w:eastAsia="Noto Naskh Arabic" w:hAnsi="Noto Naskh Arabic"/>
           <w:sz w:val="22"/>
           <w:szCs w:val="22"/>
+          <w:rtl/>
         </w:rPr>
         <w:t xml:space="preserve">ﷺ</w:t>
       </w:r>
@@ -6181,6 +6246,7 @@
           <w:rFonts w:ascii="Noto Naskh Arabic" w:cs="Noto Naskh Arabic" w:eastAsia="Noto Naskh Arabic" w:hAnsi="Noto Naskh Arabic"/>
           <w:sz w:val="22"/>
           <w:szCs w:val="22"/>
+          <w:rtl/>
         </w:rPr>
         <w:t xml:space="preserve">ﷺ</w:t>
       </w:r>
@@ -6211,6 +6277,7 @@
           <w:rFonts w:ascii="Noto Naskh Arabic" w:cs="Noto Naskh Arabic" w:eastAsia="Noto Naskh Arabic" w:hAnsi="Noto Naskh Arabic"/>
           <w:sz w:val="22"/>
           <w:szCs w:val="22"/>
+          <w:rtl/>
         </w:rPr>
         <w:t xml:space="preserve">ﷺ</w:t>
       </w:r>
@@ -6259,6 +6326,7 @@
           <w:rFonts w:ascii="Noto Naskh Arabic" w:cs="Noto Naskh Arabic" w:eastAsia="Noto Naskh Arabic" w:hAnsi="Noto Naskh Arabic"/>
           <w:sz w:val="22"/>
           <w:szCs w:val="22"/>
+          <w:rtl/>
         </w:rPr>
         <w:t xml:space="preserve">ﷺ</w:t>
       </w:r>
@@ -6290,6 +6358,7 @@
           <w:sz w:val="16"/>
           <w:szCs w:val="16"/>
           <w:vertAlign w:val="superscript"/>
+          <w:rtl/>
         </w:rPr>
         <w:t xml:space="preserve">رحمة الله تعالى عليه</w:t>
       </w:r>
@@ -6306,6 +6375,7 @@
           <w:rFonts w:ascii="Noto Naskh Arabic" w:cs="Noto Naskh Arabic" w:eastAsia="Noto Naskh Arabic" w:hAnsi="Noto Naskh Arabic"/>
           <w:sz w:val="22"/>
           <w:szCs w:val="22"/>
+          <w:rtl/>
         </w:rPr>
         <w:t xml:space="preserve">ﷺ</w:t>
       </w:r>
@@ -6335,6 +6405,7 @@
           <w:iCs/>
           <w:sz w:val="22"/>
           <w:szCs w:val="22"/>
+          <w:rtl/>
         </w:rPr>
         <w:t xml:space="preserve">فإن من جودك الدنيا وضرتها ومن علومك علم اللوح والقلم</w:t>
       </w:r>
@@ -6377,6 +6448,7 @@
           <w:sz w:val="16"/>
           <w:szCs w:val="16"/>
           <w:vertAlign w:val="superscript"/>
+          <w:rtl/>
         </w:rPr>
         <w:t xml:space="preserve">رحمة الله تعالى عليه</w:t>
       </w:r>
@@ -6408,6 +6480,7 @@
           <w:sz w:val="16"/>
           <w:szCs w:val="16"/>
           <w:vertAlign w:val="superscript"/>
+          <w:rtl/>
         </w:rPr>
         <w:t xml:space="preserve">رحمة الله تعالى عليه</w:t>
       </w:r>
@@ -6424,6 +6497,7 @@
           <w:rFonts w:ascii="Noto Naskh Arabic" w:cs="Noto Naskh Arabic" w:eastAsia="Noto Naskh Arabic" w:hAnsi="Noto Naskh Arabic"/>
           <w:sz w:val="22"/>
           <w:szCs w:val="22"/>
+          <w:rtl/>
         </w:rPr>
         <w:t xml:space="preserve">ﷺ</w:t>
       </w:r>
@@ -6440,6 +6514,7 @@
           <w:rFonts w:ascii="Noto Naskh Arabic" w:cs="Noto Naskh Arabic" w:eastAsia="Noto Naskh Arabic" w:hAnsi="Noto Naskh Arabic"/>
           <w:sz w:val="22"/>
           <w:szCs w:val="22"/>
+          <w:rtl/>
         </w:rPr>
         <w:t xml:space="preserve">ﷺ</w:t>
       </w:r>
@@ -6456,6 +6531,7 @@
           <w:rFonts w:ascii="Noto Naskh Arabic" w:cs="Noto Naskh Arabic" w:eastAsia="Noto Naskh Arabic" w:hAnsi="Noto Naskh Arabic"/>
           <w:sz w:val="22"/>
           <w:szCs w:val="22"/>
+          <w:rtl/>
         </w:rPr>
         <w:t xml:space="preserve">ﷺ</w:t>
       </w:r>
@@ -6486,6 +6562,7 @@
           <w:rFonts w:ascii="Noto Naskh Arabic" w:cs="Noto Naskh Arabic" w:eastAsia="Noto Naskh Arabic" w:hAnsi="Noto Naskh Arabic"/>
           <w:sz w:val="22"/>
           <w:szCs w:val="22"/>
+          <w:rtl/>
         </w:rPr>
         <w:t xml:space="preserve">ﷺ</w:t>
       </w:r>
@@ -6502,6 +6579,7 @@
           <w:rFonts w:ascii="Noto Naskh Arabic" w:cs="Noto Naskh Arabic" w:eastAsia="Noto Naskh Arabic" w:hAnsi="Noto Naskh Arabic"/>
           <w:sz w:val="22"/>
           <w:szCs w:val="22"/>
+          <w:rtl/>
         </w:rPr>
         <w:t xml:space="preserve">ﷺ</w:t>
       </w:r>
@@ -6568,6 +6646,7 @@
           <w:rFonts w:ascii="Noto Naskh Arabic" w:cs="Noto Naskh Arabic" w:eastAsia="Noto Naskh Arabic" w:hAnsi="Noto Naskh Arabic"/>
           <w:sz w:val="22"/>
           <w:szCs w:val="22"/>
+          <w:rtl/>
         </w:rPr>
         <w:t xml:space="preserve">ﷺ</w:t>
       </w:r>
@@ -6584,6 +6663,7 @@
           <w:rFonts w:ascii="Noto Naskh Arabic" w:cs="Noto Naskh Arabic" w:eastAsia="Noto Naskh Arabic" w:hAnsi="Noto Naskh Arabic"/>
           <w:sz w:val="22"/>
           <w:szCs w:val="22"/>
+          <w:rtl/>
         </w:rPr>
         <w:t xml:space="preserve">ﷺ</w:t>
       </w:r>
@@ -6614,6 +6694,7 @@
           <w:rFonts w:ascii="Noto Naskh Arabic" w:cs="Noto Naskh Arabic" w:eastAsia="Noto Naskh Arabic" w:hAnsi="Noto Naskh Arabic"/>
           <w:sz w:val="22"/>
           <w:szCs w:val="22"/>
+          <w:rtl/>
         </w:rPr>
         <w:t xml:space="preserve">ﷺ</w:t>
       </w:r>
@@ -6662,6 +6743,7 @@
           <w:rFonts w:ascii="Noto Naskh Arabic" w:cs="Noto Naskh Arabic" w:eastAsia="Noto Naskh Arabic" w:hAnsi="Noto Naskh Arabic"/>
           <w:sz w:val="22"/>
           <w:szCs w:val="22"/>
+          <w:rtl/>
         </w:rPr>
         <w:t xml:space="preserve">ﷺ</w:t>
       </w:r>
@@ -6705,6 +6787,7 @@
           <w:iCs/>
           <w:sz w:val="22"/>
           <w:szCs w:val="22"/>
+          <w:rtl/>
         </w:rPr>
         <w:t xml:space="preserve">"ما للحبيب بعلوم الغيب"</w:t>
       </w:r>
@@ -6736,6 +6819,7 @@
           <w:iCs/>
           <w:sz w:val="22"/>
           <w:szCs w:val="22"/>
+          <w:rtl/>
         </w:rPr>
         <w:t xml:space="preserve">"اللؤلؤ المكنون في علم البشير ما كان وما يكون"</w:t>
       </w:r>
@@ -6781,6 +6865,7 @@
           <w:iCs/>
           <w:sz w:val="22"/>
           <w:szCs w:val="22"/>
+          <w:rtl/>
         </w:rPr>
         <w:t xml:space="preserve">"انباء المصطفى بحال سر و اخفى"</w:t>
       </w:r>
@@ -6836,6 +6921,7 @@
           <w:sz w:val="16"/>
           <w:szCs w:val="16"/>
           <w:vertAlign w:val="superscript"/>
+          <w:rtl/>
         </w:rPr>
         <w:t xml:space="preserve">رضي الله تعالى عنه</w:t>
       </w:r>
@@ -6873,6 +6959,7 @@
           <w:iCs/>
           <w:sz w:val="22"/>
           <w:szCs w:val="22"/>
+          <w:rtl/>
         </w:rPr>
         <w:t xml:space="preserve">ﷺ</w:t>
       </w:r>
@@ -6905,6 +6992,7 @@
           <w:rFonts w:ascii="Noto Naskh Arabic" w:cs="Noto Naskh Arabic" w:eastAsia="Noto Naskh Arabic" w:hAnsi="Noto Naskh Arabic"/>
           <w:sz w:val="22"/>
           <w:szCs w:val="22"/>
+          <w:rtl/>
         </w:rPr>
         <w:t xml:space="preserve">ﷺ</w:t>
       </w:r>
@@ -6955,6 +7043,7 @@
           <w:sz w:val="16"/>
           <w:szCs w:val="16"/>
           <w:vertAlign w:val="superscript"/>
+          <w:rtl/>
         </w:rPr>
         <w:t xml:space="preserve">رضي الله تعالى عنه</w:t>
       </w:r>
@@ -6992,6 +7081,7 @@
           <w:iCs/>
           <w:sz w:val="22"/>
           <w:szCs w:val="22"/>
+          <w:rtl/>
         </w:rPr>
         <w:t xml:space="preserve">ﷺ</w:t>
       </w:r>
@@ -7025,6 +7115,7 @@
           <w:sz w:val="16"/>
           <w:szCs w:val="16"/>
           <w:vertAlign w:val="superscript"/>
+          <w:rtl/>
         </w:rPr>
         <w:t xml:space="preserve">رضي الله تعالى عنه</w:t>
       </w:r>
@@ -7041,6 +7132,7 @@
           <w:rFonts w:ascii="Noto Naskh Arabic" w:cs="Noto Naskh Arabic" w:eastAsia="Noto Naskh Arabic" w:hAnsi="Noto Naskh Arabic"/>
           <w:sz w:val="22"/>
           <w:szCs w:val="22"/>
+          <w:rtl/>
         </w:rPr>
         <w:t xml:space="preserve">ﷺ</w:t>
       </w:r>
@@ -7109,6 +7201,7 @@
           <w:sz w:val="16"/>
           <w:szCs w:val="16"/>
           <w:vertAlign w:val="superscript"/>
+          <w:rtl/>
         </w:rPr>
         <w:t xml:space="preserve">رضي الله تعالى عنهما</w:t>
       </w:r>
@@ -7125,6 +7218,7 @@
           <w:rFonts w:ascii="Noto Naskh Arabic" w:cs="Noto Naskh Arabic" w:eastAsia="Noto Naskh Arabic" w:hAnsi="Noto Naskh Arabic"/>
           <w:sz w:val="22"/>
           <w:szCs w:val="22"/>
+          <w:rtl/>
         </w:rPr>
         <w:t xml:space="preserve">ﷺ</w:t>
       </w:r>
@@ -7208,6 +7302,7 @@
           <w:sz w:val="16"/>
           <w:szCs w:val="16"/>
           <w:vertAlign w:val="superscript"/>
+          <w:rtl/>
         </w:rPr>
         <w:t xml:space="preserve">رضي الله تعالى عنه</w:t>
       </w:r>
@@ -7225,6 +7320,7 @@
           <w:sz w:val="16"/>
           <w:szCs w:val="16"/>
           <w:vertAlign w:val="superscript"/>
+          <w:rtl/>
         </w:rPr>
         <w:t xml:space="preserve">رضي الله تعالى عنه</w:t>
       </w:r>
@@ -7262,6 +7358,7 @@
           <w:iCs/>
           <w:sz w:val="22"/>
           <w:szCs w:val="22"/>
+          <w:rtl/>
         </w:rPr>
         <w:t xml:space="preserve">ﷺ</w:t>
       </w:r>
@@ -7372,6 +7469,7 @@
           <w:iCs/>
           <w:sz w:val="22"/>
           <w:szCs w:val="22"/>
+          <w:rtl/>
         </w:rPr>
         <w:t xml:space="preserve">ومن علومك علم اللوح والقلم</w:t>
       </w:r>
@@ -7432,6 +7530,7 @@
           <w:sz w:val="16"/>
           <w:szCs w:val="16"/>
           <w:vertAlign w:val="superscript"/>
+          <w:rtl/>
         </w:rPr>
         <w:t xml:space="preserve">رحمة الله تعالى عليه</w:t>
       </w:r>
@@ -7449,6 +7548,7 @@
           <w:sz w:val="16"/>
           <w:szCs w:val="16"/>
           <w:vertAlign w:val="superscript"/>
+          <w:rtl/>
         </w:rPr>
         <w:t xml:space="preserve">رحمة الله تعالى عليه</w:t>
       </w:r>
@@ -7465,6 +7565,7 @@
           <w:rFonts w:ascii="Noto Naskh Arabic" w:cs="Noto Naskh Arabic" w:eastAsia="Noto Naskh Arabic" w:hAnsi="Noto Naskh Arabic"/>
           <w:sz w:val="22"/>
           <w:szCs w:val="22"/>
+          <w:rtl/>
         </w:rPr>
         <w:t xml:space="preserve">ﷺ</w:t>
       </w:r>
@@ -7496,6 +7597,7 @@
           <w:sz w:val="16"/>
           <w:szCs w:val="16"/>
           <w:vertAlign w:val="superscript"/>
+          <w:rtl/>
         </w:rPr>
         <w:t xml:space="preserve">رضي الله تعالى عنهما</w:t>
       </w:r>
@@ -7512,6 +7614,7 @@
           <w:rFonts w:ascii="Noto Naskh Arabic" w:cs="Noto Naskh Arabic" w:eastAsia="Noto Naskh Arabic" w:hAnsi="Noto Naskh Arabic"/>
           <w:sz w:val="22"/>
           <w:szCs w:val="22"/>
+          <w:rtl/>
         </w:rPr>
         <w:t xml:space="preserve">ﷺ</w:t>
       </w:r>
@@ -7528,6 +7631,7 @@
           <w:rFonts w:ascii="Noto Naskh Arabic" w:cs="Noto Naskh Arabic" w:eastAsia="Noto Naskh Arabic" w:hAnsi="Noto Naskh Arabic"/>
           <w:sz w:val="22"/>
           <w:szCs w:val="22"/>
+          <w:rtl/>
         </w:rPr>
         <w:t xml:space="preserve">ﷺ</w:t>
       </w:r>
@@ -7558,6 +7662,7 @@
           <w:rFonts w:ascii="Noto Naskh Arabic" w:cs="Noto Naskh Arabic" w:eastAsia="Noto Naskh Arabic" w:hAnsi="Noto Naskh Arabic"/>
           <w:sz w:val="22"/>
           <w:szCs w:val="22"/>
+          <w:rtl/>
         </w:rPr>
         <w:t xml:space="preserve">ﷺ</w:t>
       </w:r>
@@ -7574,6 +7679,7 @@
           <w:rFonts w:ascii="Noto Naskh Arabic" w:cs="Noto Naskh Arabic" w:eastAsia="Noto Naskh Arabic" w:hAnsi="Noto Naskh Arabic"/>
           <w:sz w:val="22"/>
           <w:szCs w:val="22"/>
+          <w:rtl/>
         </w:rPr>
         <w:t xml:space="preserve">ﷺ</w:t>
       </w:r>
@@ -7605,6 +7711,7 @@
           <w:sz w:val="16"/>
           <w:szCs w:val="16"/>
           <w:vertAlign w:val="superscript"/>
+          <w:rtl/>
         </w:rPr>
         <w:t xml:space="preserve">رحمة الله تعالى عليه</w:t>
       </w:r>
@@ -7634,6 +7741,7 @@
           <w:iCs/>
           <w:sz w:val="22"/>
           <w:szCs w:val="22"/>
+          <w:rtl/>
         </w:rPr>
         <w:t xml:space="preserve">وسع العلمين علما وحكما</w:t>
       </w:r>
@@ -7694,6 +7802,7 @@
           <w:sz w:val="16"/>
           <w:szCs w:val="16"/>
           <w:vertAlign w:val="superscript"/>
+          <w:rtl/>
         </w:rPr>
         <w:t xml:space="preserve">عليه السلام</w:t>
       </w:r>
@@ -7725,6 +7834,7 @@
           <w:sz w:val="16"/>
           <w:szCs w:val="16"/>
           <w:vertAlign w:val="superscript"/>
+          <w:rtl/>
         </w:rPr>
         <w:t xml:space="preserve">عليه السلام</w:t>
       </w:r>
@@ -7774,6 +7884,7 @@
           <w:sz w:val="16"/>
           <w:szCs w:val="16"/>
           <w:vertAlign w:val="superscript"/>
+          <w:rtl/>
         </w:rPr>
         <w:t xml:space="preserve">رحمة الله تعالى عليه</w:t>
       </w:r>
@@ -7790,6 +7901,7 @@
           <w:rFonts w:ascii="Noto Naskh Arabic" w:cs="Noto Naskh Arabic" w:eastAsia="Noto Naskh Arabic" w:hAnsi="Noto Naskh Arabic"/>
           <w:sz w:val="22"/>
           <w:szCs w:val="22"/>
+          <w:rtl/>
         </w:rPr>
         <w:t xml:space="preserve">ﷺ</w:t>
       </w:r>
@@ -7806,6 +7918,7 @@
           <w:rFonts w:ascii="Noto Naskh Arabic" w:cs="Noto Naskh Arabic" w:eastAsia="Noto Naskh Arabic" w:hAnsi="Noto Naskh Arabic"/>
           <w:sz w:val="22"/>
           <w:szCs w:val="22"/>
+          <w:rtl/>
         </w:rPr>
         <w:t xml:space="preserve">ﷺ</w:t>
       </w:r>
@@ -7869,6 +7982,7 @@
           <w:rFonts w:ascii="Noto Naskh Arabic" w:cs="Noto Naskh Arabic" w:eastAsia="Noto Naskh Arabic" w:hAnsi="Noto Naskh Arabic"/>
           <w:sz w:val="22"/>
           <w:szCs w:val="22"/>
+          <w:rtl/>
         </w:rPr>
         <w:t xml:space="preserve">ﷺ</w:t>
       </w:r>
@@ -7885,6 +7999,7 @@
           <w:rFonts w:ascii="Noto Naskh Arabic" w:cs="Noto Naskh Arabic" w:eastAsia="Noto Naskh Arabic" w:hAnsi="Noto Naskh Arabic"/>
           <w:sz w:val="22"/>
           <w:szCs w:val="22"/>
+          <w:rtl/>
         </w:rPr>
         <w:t xml:space="preserve">ﷺ</w:t>
       </w:r>
@@ -7934,6 +8049,7 @@
           <w:sz w:val="16"/>
           <w:szCs w:val="16"/>
           <w:vertAlign w:val="superscript"/>
+          <w:rtl/>
         </w:rPr>
         <w:t xml:space="preserve">عليه السلام</w:t>
       </w:r>
@@ -7964,6 +8080,7 @@
           <w:rFonts w:ascii="Noto Naskh Arabic" w:cs="Noto Naskh Arabic" w:eastAsia="Noto Naskh Arabic" w:hAnsi="Noto Naskh Arabic"/>
           <w:sz w:val="22"/>
           <w:szCs w:val="22"/>
+          <w:rtl/>
         </w:rPr>
         <w:t xml:space="preserve">ﷺ</w:t>
       </w:r>
@@ -8013,6 +8130,7 @@
           <w:rFonts w:ascii="Noto Naskh Arabic" w:cs="Noto Naskh Arabic" w:eastAsia="Noto Naskh Arabic" w:hAnsi="Noto Naskh Arabic"/>
           <w:sz w:val="22"/>
           <w:szCs w:val="22"/>
+          <w:rtl/>
         </w:rPr>
         <w:t xml:space="preserve">ﷺ</w:t>
       </w:r>
@@ -8082,6 +8200,7 @@
           <w:iCs/>
           <w:sz w:val="22"/>
           <w:szCs w:val="22"/>
+          <w:rtl/>
         </w:rPr>
         <w:t xml:space="preserve">ﷺ</w:t>
       </w:r>
@@ -8102,6 +8221,7 @@
           <w:iCs/>
           <w:sz w:val="22"/>
           <w:szCs w:val="22"/>
+          <w:rtl/>
         </w:rPr>
         <w:t xml:space="preserve">ﷺ</w:t>
       </w:r>
@@ -8134,6 +8254,7 @@
           <w:rFonts w:ascii="Noto Naskh Arabic" w:cs="Noto Naskh Arabic" w:eastAsia="Noto Naskh Arabic" w:hAnsi="Noto Naskh Arabic"/>
           <w:sz w:val="22"/>
           <w:szCs w:val="22"/>
+          <w:rtl/>
         </w:rPr>
         <w:t xml:space="preserve">ﷺ</w:t>
       </w:r>
@@ -8200,6 +8321,7 @@
           <w:rFonts w:ascii="Noto Naskh Arabic" w:cs="Noto Naskh Arabic" w:eastAsia="Noto Naskh Arabic" w:hAnsi="Noto Naskh Arabic"/>
           <w:sz w:val="22"/>
           <w:szCs w:val="22"/>
+          <w:rtl/>
         </w:rPr>
         <w:t xml:space="preserve">ﷺ</w:t>
       </w:r>
@@ -8262,6 +8384,7 @@
           <w:rFonts w:ascii="Noto Naskh Arabic" w:cs="Noto Naskh Arabic" w:eastAsia="Noto Naskh Arabic" w:hAnsi="Noto Naskh Arabic"/>
           <w:sz w:val="22"/>
           <w:szCs w:val="22"/>
+          <w:rtl/>
         </w:rPr>
         <w:t xml:space="preserve">ﷺ</w:t>
       </w:r>
@@ -8310,6 +8433,7 @@
           <w:rFonts w:ascii="Noto Naskh Arabic" w:cs="Noto Naskh Arabic" w:eastAsia="Noto Naskh Arabic" w:hAnsi="Noto Naskh Arabic"/>
           <w:sz w:val="22"/>
           <w:szCs w:val="22"/>
+          <w:rtl/>
         </w:rPr>
         <w:t xml:space="preserve">ﷺ</w:t>
       </w:r>
@@ -8376,6 +8500,7 @@
           <w:rFonts w:ascii="Noto Naskh Arabic" w:cs="Noto Naskh Arabic" w:eastAsia="Noto Naskh Arabic" w:hAnsi="Noto Naskh Arabic"/>
           <w:sz w:val="22"/>
           <w:szCs w:val="22"/>
+          <w:rtl/>
         </w:rPr>
         <w:t xml:space="preserve">ﷺ</w:t>
       </w:r>
@@ -8406,6 +8531,7 @@
           <w:rFonts w:ascii="Noto Naskh Arabic" w:cs="Noto Naskh Arabic" w:eastAsia="Noto Naskh Arabic" w:hAnsi="Noto Naskh Arabic"/>
           <w:sz w:val="22"/>
           <w:szCs w:val="22"/>
+          <w:rtl/>
         </w:rPr>
         <w:t xml:space="preserve">ﷺ</w:t>
       </w:r>
@@ -8522,6 +8648,7 @@
           <w:rFonts w:ascii="Noto Naskh Arabic" w:cs="Noto Naskh Arabic" w:eastAsia="Noto Naskh Arabic" w:hAnsi="Noto Naskh Arabic"/>
           <w:sz w:val="22"/>
           <w:szCs w:val="22"/>
+          <w:rtl/>
         </w:rPr>
         <w:t xml:space="preserve">ﷺ</w:t>
       </w:r>
@@ -8556,6 +8683,7 @@
           <w:rFonts w:ascii="Noto Naskh Arabic" w:cs="Noto Naskh Arabic" w:eastAsia="Noto Naskh Arabic" w:hAnsi="Noto Naskh Arabic"/>
           <w:sz w:val="22"/>
           <w:szCs w:val="22"/>
+          <w:rtl/>
         </w:rPr>
         <w:t xml:space="preserve">ﷺ</w:t>
       </w:r>
@@ -8572,6 +8700,7 @@
           <w:rFonts w:ascii="Noto Naskh Arabic" w:cs="Noto Naskh Arabic" w:eastAsia="Noto Naskh Arabic" w:hAnsi="Noto Naskh Arabic"/>
           <w:sz w:val="22"/>
           <w:szCs w:val="22"/>
+          <w:rtl/>
         </w:rPr>
         <w:t xml:space="preserve">ﷺ</w:t>
       </w:r>
@@ -8588,6 +8717,7 @@
           <w:rFonts w:ascii="Noto Naskh Arabic" w:cs="Noto Naskh Arabic" w:eastAsia="Noto Naskh Arabic" w:hAnsi="Noto Naskh Arabic"/>
           <w:sz w:val="22"/>
           <w:szCs w:val="22"/>
+          <w:rtl/>
         </w:rPr>
         <w:t xml:space="preserve">ﷺ</w:t>
       </w:r>
@@ -8618,6 +8748,7 @@
           <w:rFonts w:ascii="Noto Naskh Arabic" w:cs="Noto Naskh Arabic" w:eastAsia="Noto Naskh Arabic" w:hAnsi="Noto Naskh Arabic"/>
           <w:sz w:val="22"/>
           <w:szCs w:val="22"/>
+          <w:rtl/>
         </w:rPr>
         <w:t xml:space="preserve">ﷺ</w:t>
       </w:r>
@@ -8634,6 +8765,7 @@
           <w:rFonts w:ascii="Noto Naskh Arabic" w:cs="Noto Naskh Arabic" w:eastAsia="Noto Naskh Arabic" w:hAnsi="Noto Naskh Arabic"/>
           <w:sz w:val="22"/>
           <w:szCs w:val="22"/>
+          <w:rtl/>
         </w:rPr>
         <w:t xml:space="preserve">ﷺ</w:t>
       </w:r>
@@ -8678,6 +8810,7 @@
           <w:rFonts w:ascii="Noto Naskh Arabic" w:cs="Noto Naskh Arabic" w:eastAsia="Noto Naskh Arabic" w:hAnsi="Noto Naskh Arabic"/>
           <w:sz w:val="22"/>
           <w:szCs w:val="22"/>
+          <w:rtl/>
         </w:rPr>
         <w:t xml:space="preserve">ﷺ</w:t>
       </w:r>
@@ -8740,6 +8873,7 @@
           <w:rFonts w:ascii="Noto Naskh Arabic" w:cs="Noto Naskh Arabic" w:eastAsia="Noto Naskh Arabic" w:hAnsi="Noto Naskh Arabic"/>
           <w:sz w:val="22"/>
           <w:szCs w:val="22"/>
+          <w:rtl/>
         </w:rPr>
         <w:t xml:space="preserve">ﷺ</w:t>
       </w:r>
@@ -8847,6 +8981,7 @@
           <w:rFonts w:ascii="Noto Naskh Arabic" w:cs="Noto Naskh Arabic" w:eastAsia="Noto Naskh Arabic" w:hAnsi="Noto Naskh Arabic"/>
           <w:sz w:val="22"/>
           <w:szCs w:val="22"/>
+          <w:rtl/>
         </w:rPr>
         <w:t xml:space="preserve">ﷺ</w:t>
       </w:r>
@@ -8877,6 +9012,7 @@
           <w:rFonts w:ascii="Noto Naskh Arabic" w:cs="Noto Naskh Arabic" w:eastAsia="Noto Naskh Arabic" w:hAnsi="Noto Naskh Arabic"/>
           <w:sz w:val="22"/>
           <w:szCs w:val="22"/>
+          <w:rtl/>
         </w:rPr>
         <w:t xml:space="preserve">ﷺ</w:t>
       </w:r>
@@ -8907,6 +9043,7 @@
           <w:rFonts w:ascii="Noto Naskh Arabic" w:cs="Noto Naskh Arabic" w:eastAsia="Noto Naskh Arabic" w:hAnsi="Noto Naskh Arabic"/>
           <w:sz w:val="22"/>
           <w:szCs w:val="22"/>
+          <w:rtl/>
         </w:rPr>
         <w:t xml:space="preserve">ﷺ</w:t>
       </w:r>
@@ -8969,6 +9106,7 @@
           <w:rFonts w:ascii="Noto Naskh Arabic" w:cs="Noto Naskh Arabic" w:eastAsia="Noto Naskh Arabic" w:hAnsi="Noto Naskh Arabic"/>
           <w:sz w:val="22"/>
           <w:szCs w:val="22"/>
+          <w:rtl/>
         </w:rPr>
         <w:t xml:space="preserve">ﷺ</w:t>
       </w:r>
@@ -9383,6 +9521,7 @@
           <w:rFonts w:ascii="Noto Naskh Arabic" w:cs="Noto Naskh Arabic" w:eastAsia="Noto Naskh Arabic" w:hAnsi="Noto Naskh Arabic"/>
           <w:sz w:val="22"/>
           <w:szCs w:val="22"/>
+          <w:rtl/>
         </w:rPr>
         <w:t xml:space="preserve">ﷺ</w:t>
       </w:r>
@@ -9399,6 +9538,7 @@
           <w:rFonts w:ascii="Noto Naskh Arabic" w:cs="Noto Naskh Arabic" w:eastAsia="Noto Naskh Arabic" w:hAnsi="Noto Naskh Arabic"/>
           <w:sz w:val="22"/>
           <w:szCs w:val="22"/>
+          <w:rtl/>
         </w:rPr>
         <w:t xml:space="preserve">ﷺ</w:t>
       </w:r>
@@ -9448,6 +9588,7 @@
           <w:rFonts w:ascii="Noto Naskh Arabic" w:cs="Noto Naskh Arabic" w:eastAsia="Noto Naskh Arabic" w:hAnsi="Noto Naskh Arabic"/>
           <w:sz w:val="22"/>
           <w:szCs w:val="22"/>
+          <w:rtl/>
         </w:rPr>
         <w:t xml:space="preserve">ﷺ</w:t>
       </w:r>
@@ -9620,6 +9761,7 @@
           <w:rFonts w:ascii="Noto Naskh Arabic" w:cs="Noto Naskh Arabic" w:eastAsia="Noto Naskh Arabic" w:hAnsi="Noto Naskh Arabic"/>
           <w:sz w:val="22"/>
           <w:szCs w:val="22"/>
+          <w:rtl/>
         </w:rPr>
         <w:t xml:space="preserve">ﷺ</w:t>
       </w:r>
@@ -9686,6 +9828,7 @@
           <w:rFonts w:ascii="Noto Naskh Arabic" w:cs="Noto Naskh Arabic" w:eastAsia="Noto Naskh Arabic" w:hAnsi="Noto Naskh Arabic"/>
           <w:sz w:val="22"/>
           <w:szCs w:val="22"/>
+          <w:rtl/>
         </w:rPr>
         <w:t xml:space="preserve">ﷺ</w:t>
       </w:r>
@@ -9702,6 +9845,7 @@
           <w:rFonts w:ascii="Noto Naskh Arabic" w:cs="Noto Naskh Arabic" w:eastAsia="Noto Naskh Arabic" w:hAnsi="Noto Naskh Arabic"/>
           <w:sz w:val="22"/>
           <w:szCs w:val="22"/>
+          <w:rtl/>
         </w:rPr>
         <w:t xml:space="preserve">ﷺ</w:t>
       </w:r>
@@ -9880,6 +10024,7 @@
           <w:sz w:val="16"/>
           <w:szCs w:val="16"/>
           <w:vertAlign w:val="superscript"/>
+          <w:rtl/>
         </w:rPr>
         <w:t xml:space="preserve">عليه السلام</w:t>
       </w:r>
@@ -10036,6 +10181,7 @@
           <w:rFonts w:ascii="Noto Naskh Arabic" w:cs="Noto Naskh Arabic" w:eastAsia="Noto Naskh Arabic" w:hAnsi="Noto Naskh Arabic"/>
           <w:sz w:val="22"/>
           <w:szCs w:val="22"/>
+          <w:rtl/>
         </w:rPr>
         <w:t xml:space="preserve">ﷺ</w:t>
       </w:r>
@@ -10085,6 +10231,7 @@
           <w:rFonts w:ascii="Noto Naskh Arabic" w:cs="Noto Naskh Arabic" w:eastAsia="Noto Naskh Arabic" w:hAnsi="Noto Naskh Arabic"/>
           <w:sz w:val="22"/>
           <w:szCs w:val="22"/>
+          <w:rtl/>
         </w:rPr>
         <w:t xml:space="preserve">ﷺ</w:t>
       </w:r>
@@ -10145,6 +10292,7 @@
           <w:iCs/>
           <w:sz w:val="22"/>
           <w:szCs w:val="22"/>
+          <w:rtl/>
         </w:rPr>
         <w:t xml:space="preserve">"البحث الفاحص عن طرق أحاديث الخصائص"</w:t>
       </w:r>
@@ -10213,6 +10361,7 @@
           <w:rFonts w:ascii="Noto Naskh Arabic" w:cs="Noto Naskh Arabic" w:eastAsia="Noto Naskh Arabic" w:hAnsi="Noto Naskh Arabic"/>
           <w:sz w:val="22"/>
           <w:szCs w:val="22"/>
+          <w:rtl/>
         </w:rPr>
         <w:t xml:space="preserve">ﷺ</w:t>
       </w:r>
@@ -10375,6 +10524,7 @@
           <w:rFonts w:ascii="Noto Naskh Arabic" w:cs="Noto Naskh Arabic" w:eastAsia="Noto Naskh Arabic" w:hAnsi="Noto Naskh Arabic"/>
           <w:sz w:val="22"/>
           <w:szCs w:val="22"/>
+          <w:rtl/>
         </w:rPr>
         <w:t xml:space="preserve">ﷺ</w:t>
       </w:r>
@@ -10405,6 +10555,7 @@
           <w:rFonts w:ascii="Noto Naskh Arabic" w:cs="Noto Naskh Arabic" w:eastAsia="Noto Naskh Arabic" w:hAnsi="Noto Naskh Arabic"/>
           <w:sz w:val="22"/>
           <w:szCs w:val="22"/>
+          <w:rtl/>
         </w:rPr>
         <w:t xml:space="preserve">ﷺ</w:t>
       </w:r>
@@ -10421,6 +10572,7 @@
           <w:rFonts w:ascii="Noto Naskh Arabic" w:cs="Noto Naskh Arabic" w:eastAsia="Noto Naskh Arabic" w:hAnsi="Noto Naskh Arabic"/>
           <w:sz w:val="22"/>
           <w:szCs w:val="22"/>
+          <w:rtl/>
         </w:rPr>
         <w:t xml:space="preserve">ﷺ</w:t>
       </w:r>
@@ -10437,6 +10589,7 @@
           <w:rFonts w:ascii="Noto Naskh Arabic" w:cs="Noto Naskh Arabic" w:eastAsia="Noto Naskh Arabic" w:hAnsi="Noto Naskh Arabic"/>
           <w:sz w:val="22"/>
           <w:szCs w:val="22"/>
+          <w:rtl/>
         </w:rPr>
         <w:t xml:space="preserve">ﷺ</w:t>
       </w:r>
@@ -10501,6 +10654,7 @@
           <w:sz w:val="16"/>
           <w:szCs w:val="16"/>
           <w:vertAlign w:val="superscript"/>
+          <w:rtl/>
         </w:rPr>
         <w:t xml:space="preserve">رضي الله تعالى عنه</w:t>
       </w:r>
@@ -10517,6 +10671,7 @@
           <w:rFonts w:ascii="Noto Naskh Arabic" w:cs="Noto Naskh Arabic" w:eastAsia="Noto Naskh Arabic" w:hAnsi="Noto Naskh Arabic"/>
           <w:sz w:val="22"/>
           <w:szCs w:val="22"/>
+          <w:rtl/>
         </w:rPr>
         <w:t xml:space="preserve">ﷺ</w:t>
       </w:r>
@@ -10630,6 +10785,7 @@
           <w:sz w:val="16"/>
           <w:szCs w:val="16"/>
           <w:vertAlign w:val="superscript"/>
+          <w:rtl/>
         </w:rPr>
         <w:t xml:space="preserve">رضي الله تعالى عنه</w:t>
       </w:r>
@@ -10646,6 +10802,7 @@
           <w:rFonts w:ascii="Noto Naskh Arabic" w:cs="Noto Naskh Arabic" w:eastAsia="Noto Naskh Arabic" w:hAnsi="Noto Naskh Arabic"/>
           <w:sz w:val="22"/>
           <w:szCs w:val="22"/>
+          <w:rtl/>
         </w:rPr>
         <w:t xml:space="preserve">ﷺ</w:t>
       </w:r>
@@ -10676,6 +10833,7 @@
           <w:rFonts w:ascii="Noto Naskh Arabic" w:cs="Noto Naskh Arabic" w:eastAsia="Noto Naskh Arabic" w:hAnsi="Noto Naskh Arabic"/>
           <w:sz w:val="22"/>
           <w:szCs w:val="22"/>
+          <w:rtl/>
         </w:rPr>
         <w:t xml:space="preserve">ﷺ</w:t>
       </w:r>
@@ -10815,6 +10973,7 @@
           <w:sz w:val="16"/>
           <w:szCs w:val="16"/>
           <w:vertAlign w:val="superscript"/>
+          <w:rtl/>
         </w:rPr>
         <w:t xml:space="preserve">رضي الله تعالى عنه</w:t>
       </w:r>
@@ -10831,6 +10990,7 @@
           <w:rFonts w:ascii="Noto Naskh Arabic" w:cs="Noto Naskh Arabic" w:eastAsia="Noto Naskh Arabic" w:hAnsi="Noto Naskh Arabic"/>
           <w:sz w:val="22"/>
           <w:szCs w:val="22"/>
+          <w:rtl/>
         </w:rPr>
         <w:t xml:space="preserve">ﷺ</w:t>
       </w:r>
@@ -10879,6 +11039,7 @@
           <w:rFonts w:ascii="Noto Naskh Arabic" w:cs="Noto Naskh Arabic" w:eastAsia="Noto Naskh Arabic" w:hAnsi="Noto Naskh Arabic"/>
           <w:sz w:val="22"/>
           <w:szCs w:val="22"/>
+          <w:rtl/>
         </w:rPr>
         <w:t xml:space="preserve">ﷺ</w:t>
       </w:r>
@@ -10895,6 +11056,7 @@
           <w:rFonts w:ascii="Noto Naskh Arabic" w:cs="Noto Naskh Arabic" w:eastAsia="Noto Naskh Arabic" w:hAnsi="Noto Naskh Arabic"/>
           <w:sz w:val="22"/>
           <w:szCs w:val="22"/>
+          <w:rtl/>
         </w:rPr>
         <w:t xml:space="preserve">ﷺ</w:t>
       </w:r>
@@ -10925,6 +11087,7 @@
           <w:rFonts w:ascii="Noto Naskh Arabic" w:cs="Noto Naskh Arabic" w:eastAsia="Noto Naskh Arabic" w:hAnsi="Noto Naskh Arabic"/>
           <w:sz w:val="22"/>
           <w:szCs w:val="22"/>
+          <w:rtl/>
         </w:rPr>
         <w:t xml:space="preserve">ﷺ</w:t>
       </w:r>
@@ -10941,6 +11104,7 @@
           <w:rFonts w:ascii="Noto Naskh Arabic" w:cs="Noto Naskh Arabic" w:eastAsia="Noto Naskh Arabic" w:hAnsi="Noto Naskh Arabic"/>
           <w:sz w:val="22"/>
           <w:szCs w:val="22"/>
+          <w:rtl/>
         </w:rPr>
         <w:t xml:space="preserve">ﷺ</w:t>
       </w:r>
@@ -10957,6 +11121,7 @@
           <w:rFonts w:ascii="Noto Naskh Arabic" w:cs="Noto Naskh Arabic" w:eastAsia="Noto Naskh Arabic" w:hAnsi="Noto Naskh Arabic"/>
           <w:sz w:val="22"/>
           <w:szCs w:val="22"/>
+          <w:rtl/>
         </w:rPr>
         <w:t xml:space="preserve">ﷺ</w:t>
       </w:r>
@@ -10973,6 +11138,7 @@
           <w:rFonts w:ascii="Noto Naskh Arabic" w:cs="Noto Naskh Arabic" w:eastAsia="Noto Naskh Arabic" w:hAnsi="Noto Naskh Arabic"/>
           <w:sz w:val="22"/>
           <w:szCs w:val="22"/>
+          <w:rtl/>
         </w:rPr>
         <w:t xml:space="preserve">ﷺ</w:t>
       </w:r>
@@ -11003,6 +11169,7 @@
           <w:rFonts w:ascii="Noto Naskh Arabic" w:cs="Noto Naskh Arabic" w:eastAsia="Noto Naskh Arabic" w:hAnsi="Noto Naskh Arabic"/>
           <w:sz w:val="22"/>
           <w:szCs w:val="22"/>
+          <w:rtl/>
         </w:rPr>
         <w:t xml:space="preserve">ﷺ</w:t>
       </w:r>
@@ -11019,6 +11186,7 @@
           <w:rFonts w:ascii="Noto Naskh Arabic" w:cs="Noto Naskh Arabic" w:eastAsia="Noto Naskh Arabic" w:hAnsi="Noto Naskh Arabic"/>
           <w:sz w:val="22"/>
           <w:szCs w:val="22"/>
+          <w:rtl/>
         </w:rPr>
         <w:t xml:space="preserve">ﷺ</w:t>
       </w:r>
@@ -11035,6 +11203,7 @@
           <w:rFonts w:ascii="Noto Naskh Arabic" w:cs="Noto Naskh Arabic" w:eastAsia="Noto Naskh Arabic" w:hAnsi="Noto Naskh Arabic"/>
           <w:sz w:val="22"/>
           <w:szCs w:val="22"/>
+          <w:rtl/>
         </w:rPr>
         <w:t xml:space="preserve">ﷺ</w:t>
       </w:r>
@@ -11065,6 +11234,7 @@
           <w:rFonts w:ascii="Noto Naskh Arabic" w:cs="Noto Naskh Arabic" w:eastAsia="Noto Naskh Arabic" w:hAnsi="Noto Naskh Arabic"/>
           <w:sz w:val="22"/>
           <w:szCs w:val="22"/>
+          <w:rtl/>
         </w:rPr>
         <w:t xml:space="preserve">ﷺ</w:t>
       </w:r>
@@ -11081,6 +11251,7 @@
           <w:rFonts w:ascii="Noto Naskh Arabic" w:cs="Noto Naskh Arabic" w:eastAsia="Noto Naskh Arabic" w:hAnsi="Noto Naskh Arabic"/>
           <w:sz w:val="22"/>
           <w:szCs w:val="22"/>
+          <w:rtl/>
         </w:rPr>
         <w:t xml:space="preserve">ﷺ</w:t>
       </w:r>
@@ -11111,6 +11282,7 @@
           <w:rFonts w:ascii="Noto Naskh Arabic" w:cs="Noto Naskh Arabic" w:eastAsia="Noto Naskh Arabic" w:hAnsi="Noto Naskh Arabic"/>
           <w:sz w:val="22"/>
           <w:szCs w:val="22"/>
+          <w:rtl/>
         </w:rPr>
         <w:t xml:space="preserve">ﷺ</w:t>
       </w:r>
@@ -11127,6 +11299,7 @@
           <w:rFonts w:ascii="Noto Naskh Arabic" w:cs="Noto Naskh Arabic" w:eastAsia="Noto Naskh Arabic" w:hAnsi="Noto Naskh Arabic"/>
           <w:sz w:val="22"/>
           <w:szCs w:val="22"/>
+          <w:rtl/>
         </w:rPr>
         <w:t xml:space="preserve">ﷺ</w:t>
       </w:r>
@@ -11283,6 +11456,7 @@
           <w:rFonts w:ascii="Noto Naskh Arabic" w:cs="Noto Naskh Arabic" w:eastAsia="Noto Naskh Arabic" w:hAnsi="Noto Naskh Arabic"/>
           <w:sz w:val="22"/>
           <w:szCs w:val="22"/>
+          <w:rtl/>
         </w:rPr>
         <w:t xml:space="preserve">ﷺ</w:t>
       </w:r>
@@ -11317,6 +11491,7 @@
           <w:rFonts w:ascii="Noto Naskh Arabic" w:cs="Noto Naskh Arabic" w:eastAsia="Noto Naskh Arabic" w:hAnsi="Noto Naskh Arabic"/>
           <w:sz w:val="22"/>
           <w:szCs w:val="22"/>
+          <w:rtl/>
         </w:rPr>
         <w:t xml:space="preserve">ﷺ</w:t>
       </w:r>
@@ -11333,6 +11508,7 @@
           <w:rFonts w:ascii="Noto Naskh Arabic" w:cs="Noto Naskh Arabic" w:eastAsia="Noto Naskh Arabic" w:hAnsi="Noto Naskh Arabic"/>
           <w:sz w:val="22"/>
           <w:szCs w:val="22"/>
+          <w:rtl/>
         </w:rPr>
         <w:t xml:space="preserve">ﷺ</w:t>
       </w:r>
@@ -11508,6 +11684,7 @@
           <w:sz w:val="16"/>
           <w:szCs w:val="16"/>
           <w:vertAlign w:val="superscript"/>
+          <w:rtl/>
         </w:rPr>
         <w:t xml:space="preserve">رحمة الله تعالى عليه</w:t>
       </w:r>
@@ -11574,6 +11751,7 @@
           <w:rFonts w:ascii="Noto Naskh Arabic" w:cs="Noto Naskh Arabic" w:eastAsia="Noto Naskh Arabic" w:hAnsi="Noto Naskh Arabic"/>
           <w:sz w:val="22"/>
           <w:szCs w:val="22"/>
+          <w:rtl/>
         </w:rPr>
         <w:t xml:space="preserve">ﷺ</w:t>
       </w:r>
@@ -11590,6 +11768,7 @@
           <w:rFonts w:ascii="Noto Naskh Arabic" w:cs="Noto Naskh Arabic" w:eastAsia="Noto Naskh Arabic" w:hAnsi="Noto Naskh Arabic"/>
           <w:sz w:val="22"/>
           <w:szCs w:val="22"/>
+          <w:rtl/>
         </w:rPr>
         <w:t xml:space="preserve">ﷺ</w:t>
       </w:r>
@@ -11606,6 +11785,7 @@
           <w:rFonts w:ascii="Noto Naskh Arabic" w:cs="Noto Naskh Arabic" w:eastAsia="Noto Naskh Arabic" w:hAnsi="Noto Naskh Arabic"/>
           <w:sz w:val="22"/>
           <w:szCs w:val="22"/>
+          <w:rtl/>
         </w:rPr>
         <w:t xml:space="preserve">ﷺ</w:t>
       </w:r>
@@ -11637,6 +11817,7 @@
           <w:sz w:val="16"/>
           <w:szCs w:val="16"/>
           <w:vertAlign w:val="superscript"/>
+          <w:rtl/>
         </w:rPr>
         <w:t xml:space="preserve">رحمة الله تعالى عليه</w:t>
       </w:r>
@@ -11671,6 +11852,7 @@
           <w:rFonts w:ascii="Noto Naskh Arabic" w:cs="Noto Naskh Arabic" w:eastAsia="Noto Naskh Arabic" w:hAnsi="Noto Naskh Arabic"/>
           <w:sz w:val="22"/>
           <w:szCs w:val="22"/>
+          <w:rtl/>
         </w:rPr>
         <w:t xml:space="preserve">ﷺ</w:t>
       </w:r>
@@ -11727,6 +11909,7 @@
           <w:rFonts w:ascii="Noto Naskh Arabic" w:cs="Noto Naskh Arabic" w:eastAsia="Noto Naskh Arabic" w:hAnsi="Noto Naskh Arabic"/>
           <w:sz w:val="22"/>
           <w:szCs w:val="22"/>
+          <w:rtl/>
         </w:rPr>
         <w:t xml:space="preserve">ﷺ</w:t>
       </w:r>
@@ -11808,6 +11991,7 @@
           <w:sz w:val="16"/>
           <w:szCs w:val="16"/>
           <w:vertAlign w:val="superscript"/>
+          <w:rtl/>
         </w:rPr>
         <w:t xml:space="preserve">رحمة الله تعالى عليه</w:t>
       </w:r>
@@ -11842,6 +12026,7 @@
           <w:rFonts w:ascii="Noto Naskh Arabic" w:cs="Noto Naskh Arabic" w:eastAsia="Noto Naskh Arabic" w:hAnsi="Noto Naskh Arabic"/>
           <w:sz w:val="22"/>
           <w:szCs w:val="22"/>
+          <w:rtl/>
         </w:rPr>
         <w:t xml:space="preserve">ﷺ</w:t>
       </w:r>
@@ -11898,6 +12083,7 @@
           <w:rFonts w:ascii="Noto Naskh Arabic" w:cs="Noto Naskh Arabic" w:eastAsia="Noto Naskh Arabic" w:hAnsi="Noto Naskh Arabic"/>
           <w:sz w:val="22"/>
           <w:szCs w:val="22"/>
+          <w:rtl/>
         </w:rPr>
         <w:t xml:space="preserve">ﷺ</w:t>
       </w:r>
@@ -11968,6 +12154,7 @@
           <w:rFonts w:ascii="Noto Naskh Arabic" w:cs="Noto Naskh Arabic" w:eastAsia="Noto Naskh Arabic" w:hAnsi="Noto Naskh Arabic"/>
           <w:sz w:val="22"/>
           <w:szCs w:val="22"/>
+          <w:rtl/>
         </w:rPr>
         <w:t xml:space="preserve">ﷺ</w:t>
       </w:r>
@@ -12088,6 +12275,7 @@
           <w:rFonts w:ascii="Noto Naskh Arabic" w:cs="Noto Naskh Arabic" w:eastAsia="Noto Naskh Arabic" w:hAnsi="Noto Naskh Arabic"/>
           <w:sz w:val="22"/>
           <w:szCs w:val="22"/>
+          <w:rtl/>
         </w:rPr>
         <w:t xml:space="preserve">ﷺ</w:t>
       </w:r>
@@ -12132,6 +12320,7 @@
           <w:rFonts w:ascii="Noto Naskh Arabic" w:cs="Noto Naskh Arabic" w:eastAsia="Noto Naskh Arabic" w:hAnsi="Noto Naskh Arabic"/>
           <w:sz w:val="22"/>
           <w:szCs w:val="22"/>
+          <w:rtl/>
         </w:rPr>
         <w:t xml:space="preserve">ﷺ</w:t>
       </w:r>
@@ -12148,6 +12337,7 @@
           <w:rFonts w:ascii="Noto Naskh Arabic" w:cs="Noto Naskh Arabic" w:eastAsia="Noto Naskh Arabic" w:hAnsi="Noto Naskh Arabic"/>
           <w:sz w:val="22"/>
           <w:szCs w:val="22"/>
+          <w:rtl/>
         </w:rPr>
         <w:t xml:space="preserve">ﷺ</w:t>
       </w:r>
@@ -12164,6 +12354,7 @@
           <w:rFonts w:ascii="Noto Naskh Arabic" w:cs="Noto Naskh Arabic" w:eastAsia="Noto Naskh Arabic" w:hAnsi="Noto Naskh Arabic"/>
           <w:sz w:val="22"/>
           <w:szCs w:val="22"/>
+          <w:rtl/>
         </w:rPr>
         <w:t xml:space="preserve">ﷺ</w:t>
       </w:r>
@@ -12198,6 +12389,7 @@
           <w:rFonts w:ascii="Noto Naskh Arabic" w:cs="Noto Naskh Arabic" w:eastAsia="Noto Naskh Arabic" w:hAnsi="Noto Naskh Arabic"/>
           <w:sz w:val="22"/>
           <w:szCs w:val="22"/>
+          <w:rtl/>
         </w:rPr>
         <w:t xml:space="preserve">ﷺ</w:t>
       </w:r>
@@ -12214,6 +12406,7 @@
           <w:rFonts w:ascii="Noto Naskh Arabic" w:cs="Noto Naskh Arabic" w:eastAsia="Noto Naskh Arabic" w:hAnsi="Noto Naskh Arabic"/>
           <w:sz w:val="22"/>
           <w:szCs w:val="22"/>
+          <w:rtl/>
         </w:rPr>
         <w:t xml:space="preserve">ﷺ</w:t>
       </w:r>
@@ -12289,6 +12482,7 @@
           <w:sz w:val="16"/>
           <w:szCs w:val="16"/>
           <w:vertAlign w:val="superscript"/>
+          <w:rtl/>
         </w:rPr>
         <w:t xml:space="preserve">رضي الله تعالى عنه</w:t>
       </w:r>
@@ -12306,6 +12500,7 @@
           <w:sz w:val="16"/>
           <w:szCs w:val="16"/>
           <w:vertAlign w:val="superscript"/>
+          <w:rtl/>
         </w:rPr>
         <w:t xml:space="preserve">رضي الله تعالى عنها</w:t>
       </w:r>
@@ -12322,6 +12517,7 @@
           <w:rFonts w:ascii="Noto Naskh Arabic" w:cs="Noto Naskh Arabic" w:eastAsia="Noto Naskh Arabic" w:hAnsi="Noto Naskh Arabic"/>
           <w:sz w:val="22"/>
           <w:szCs w:val="22"/>
+          <w:rtl/>
         </w:rPr>
         <w:t xml:space="preserve">ﷺ</w:t>
       </w:r>
@@ -12338,6 +12534,7 @@
           <w:rFonts w:ascii="Noto Naskh Arabic" w:cs="Noto Naskh Arabic" w:eastAsia="Noto Naskh Arabic" w:hAnsi="Noto Naskh Arabic"/>
           <w:sz w:val="22"/>
           <w:szCs w:val="22"/>
+          <w:rtl/>
         </w:rPr>
         <w:t xml:space="preserve">ﷺ</w:t>
       </w:r>
@@ -12354,6 +12551,7 @@
           <w:rFonts w:ascii="Noto Naskh Arabic" w:cs="Noto Naskh Arabic" w:eastAsia="Noto Naskh Arabic" w:hAnsi="Noto Naskh Arabic"/>
           <w:sz w:val="22"/>
           <w:szCs w:val="22"/>
+          <w:rtl/>
         </w:rPr>
         <w:t xml:space="preserve">ﷺ</w:t>
       </w:r>
@@ -12385,6 +12583,7 @@
           <w:sz w:val="16"/>
           <w:szCs w:val="16"/>
           <w:vertAlign w:val="superscript"/>
+          <w:rtl/>
         </w:rPr>
         <w:t xml:space="preserve">رضي الله تعالى عنها</w:t>
       </w:r>
@@ -12401,6 +12600,7 @@
           <w:rFonts w:ascii="Noto Naskh Arabic" w:cs="Noto Naskh Arabic" w:eastAsia="Noto Naskh Arabic" w:hAnsi="Noto Naskh Arabic"/>
           <w:sz w:val="22"/>
           <w:szCs w:val="22"/>
+          <w:rtl/>
         </w:rPr>
         <w:t xml:space="preserve">ﷺ</w:t>
       </w:r>
@@ -12417,6 +12617,7 @@
           <w:rFonts w:ascii="Noto Naskh Arabic" w:cs="Noto Naskh Arabic" w:eastAsia="Noto Naskh Arabic" w:hAnsi="Noto Naskh Arabic"/>
           <w:sz w:val="22"/>
           <w:szCs w:val="22"/>
+          <w:rtl/>
         </w:rPr>
         <w:t xml:space="preserve">ﷺ</w:t>
       </w:r>
@@ -12484,6 +12685,7 @@
           <w:sz w:val="16"/>
           <w:szCs w:val="16"/>
           <w:vertAlign w:val="superscript"/>
+          <w:rtl/>
         </w:rPr>
         <w:t xml:space="preserve">رضي الله تعالى عنه</w:t>
       </w:r>
@@ -12514,6 +12716,7 @@
           <w:rFonts w:ascii="Noto Naskh Arabic" w:cs="Noto Naskh Arabic" w:eastAsia="Noto Naskh Arabic" w:hAnsi="Noto Naskh Arabic"/>
           <w:sz w:val="22"/>
           <w:szCs w:val="22"/>
+          <w:rtl/>
         </w:rPr>
         <w:t xml:space="preserve">ﷺ</w:t>
       </w:r>
@@ -12571,6 +12774,7 @@
           <w:sz w:val="16"/>
           <w:szCs w:val="16"/>
           <w:vertAlign w:val="superscript"/>
+          <w:rtl/>
         </w:rPr>
         <w:t xml:space="preserve">رضي الله تعالى عنها</w:t>
       </w:r>
@@ -12588,6 +12792,7 @@
           <w:sz w:val="16"/>
           <w:szCs w:val="16"/>
           <w:vertAlign w:val="superscript"/>
+          <w:rtl/>
         </w:rPr>
         <w:t xml:space="preserve">رضي الله تعالى عنه</w:t>
       </w:r>
@@ -12651,6 +12856,7 @@
           <w:sz w:val="16"/>
           <w:szCs w:val="16"/>
           <w:vertAlign w:val="superscript"/>
+          <w:rtl/>
         </w:rPr>
         <w:t xml:space="preserve">رضي الله تعالى عنها</w:t>
       </w:r>
@@ -12772,6 +12978,7 @@
           <w:sz w:val="16"/>
           <w:szCs w:val="16"/>
           <w:vertAlign w:val="superscript"/>
+          <w:rtl/>
         </w:rPr>
         <w:t xml:space="preserve">رضي الله تعالى عنه</w:t>
       </w:r>
@@ -12788,6 +12995,7 @@
           <w:rFonts w:ascii="Noto Naskh Arabic" w:cs="Noto Naskh Arabic" w:eastAsia="Noto Naskh Arabic" w:hAnsi="Noto Naskh Arabic"/>
           <w:sz w:val="22"/>
           <w:szCs w:val="22"/>
+          <w:rtl/>
         </w:rPr>
         <w:t xml:space="preserve">ﷺ</w:t>
       </w:r>
@@ -12844,6 +13052,7 @@
           <w:rFonts w:ascii="Noto Naskh Arabic" w:cs="Noto Naskh Arabic" w:eastAsia="Noto Naskh Arabic" w:hAnsi="Noto Naskh Arabic"/>
           <w:sz w:val="22"/>
           <w:szCs w:val="22"/>
+          <w:rtl/>
         </w:rPr>
         <w:t xml:space="preserve">ﷺ</w:t>
       </w:r>
@@ -12861,6 +13070,7 @@
           <w:sz w:val="16"/>
           <w:szCs w:val="16"/>
           <w:vertAlign w:val="superscript"/>
+          <w:rtl/>
         </w:rPr>
         <w:t xml:space="preserve">رضي الله تعالى عنه</w:t>
       </w:r>
@@ -12917,6 +13127,7 @@
           <w:rFonts w:ascii="Noto Naskh Arabic" w:cs="Noto Naskh Arabic" w:eastAsia="Noto Naskh Arabic" w:hAnsi="Noto Naskh Arabic"/>
           <w:sz w:val="22"/>
           <w:szCs w:val="22"/>
+          <w:rtl/>
         </w:rPr>
         <w:t xml:space="preserve">ﷺ</w:t>
       </w:r>
@@ -12933,6 +13144,7 @@
           <w:rFonts w:ascii="Noto Naskh Arabic" w:cs="Noto Naskh Arabic" w:eastAsia="Noto Naskh Arabic" w:hAnsi="Noto Naskh Arabic"/>
           <w:sz w:val="22"/>
           <w:szCs w:val="22"/>
+          <w:rtl/>
         </w:rPr>
         <w:t xml:space="preserve">ﷺ</w:t>
       </w:r>
@@ -12950,6 +13162,7 @@
           <w:sz w:val="16"/>
           <w:szCs w:val="16"/>
           <w:vertAlign w:val="superscript"/>
+          <w:rtl/>
         </w:rPr>
         <w:t xml:space="preserve">عليه السلام</w:t>
       </w:r>
@@ -13017,6 +13230,7 @@
           <w:sz w:val="16"/>
           <w:szCs w:val="16"/>
           <w:vertAlign w:val="superscript"/>
+          <w:rtl/>
         </w:rPr>
         <w:t xml:space="preserve">رضي الله تعالى عنه</w:t>
       </w:r>
@@ -13033,6 +13247,7 @@
           <w:rFonts w:ascii="Noto Naskh Arabic" w:cs="Noto Naskh Arabic" w:eastAsia="Noto Naskh Arabic" w:hAnsi="Noto Naskh Arabic"/>
           <w:sz w:val="22"/>
           <w:szCs w:val="22"/>
+          <w:rtl/>
         </w:rPr>
         <w:t xml:space="preserve">ﷺ</w:t>
       </w:r>
@@ -13064,6 +13279,7 @@
           <w:sz w:val="16"/>
           <w:szCs w:val="16"/>
           <w:vertAlign w:val="superscript"/>
+          <w:rtl/>
         </w:rPr>
         <w:t xml:space="preserve">رضي الله تعالى عنه</w:t>
       </w:r>
@@ -13094,6 +13310,7 @@
           <w:rFonts w:ascii="Noto Naskh Arabic" w:cs="Noto Naskh Arabic" w:eastAsia="Noto Naskh Arabic" w:hAnsi="Noto Naskh Arabic"/>
           <w:sz w:val="22"/>
           <w:szCs w:val="22"/>
+          <w:rtl/>
         </w:rPr>
         <w:t xml:space="preserve">ﷺ</w:t>
       </w:r>
@@ -13111,6 +13328,7 @@
           <w:sz w:val="16"/>
           <w:szCs w:val="16"/>
           <w:vertAlign w:val="superscript"/>
+          <w:rtl/>
         </w:rPr>
         <w:t xml:space="preserve">رضي الله تعالى عنه</w:t>
       </w:r>
@@ -13146,6 +13364,7 @@
           <w:sz w:val="16"/>
           <w:szCs w:val="16"/>
           <w:vertAlign w:val="superscript"/>
+          <w:rtl/>
         </w:rPr>
         <w:t xml:space="preserve">رضي الله تعالى عنه</w:t>
       </w:r>
@@ -13163,6 +13382,7 @@
           <w:sz w:val="16"/>
           <w:szCs w:val="16"/>
           <w:vertAlign w:val="superscript"/>
+          <w:rtl/>
         </w:rPr>
         <w:t xml:space="preserve">رضي الله تعالى عنه</w:t>
       </w:r>
@@ -13180,6 +13400,7 @@
           <w:sz w:val="16"/>
           <w:szCs w:val="16"/>
           <w:vertAlign w:val="superscript"/>
+          <w:rtl/>
         </w:rPr>
         <w:t xml:space="preserve">رضي الله تعالى عنه</w:t>
       </w:r>
@@ -13264,6 +13485,7 @@
           <w:sz w:val="16"/>
           <w:szCs w:val="16"/>
           <w:vertAlign w:val="superscript"/>
+          <w:rtl/>
         </w:rPr>
         <w:t xml:space="preserve">قدس سره</w:t>
       </w:r>
@@ -13335,6 +13557,7 @@
           <w:sz w:val="16"/>
           <w:szCs w:val="16"/>
           <w:vertAlign w:val="superscript"/>
+          <w:rtl/>
         </w:rPr>
         <w:t xml:space="preserve">رضي الله تعالى عنه</w:t>
       </w:r>
@@ -13370,6 +13593,7 @@
           <w:sz w:val="16"/>
           <w:szCs w:val="16"/>
           <w:vertAlign w:val="superscript"/>
+          <w:rtl/>
         </w:rPr>
         <w:t xml:space="preserve">رحمة الله تعالى عليه</w:t>
       </w:r>
@@ -13451,6 +13675,7 @@
           <w:sz w:val="16"/>
           <w:szCs w:val="16"/>
           <w:vertAlign w:val="superscript"/>
+          <w:rtl/>
         </w:rPr>
         <w:t xml:space="preserve">قدس سره</w:t>
       </w:r>
@@ -13486,6 +13711,7 @@
           <w:sz w:val="16"/>
           <w:szCs w:val="16"/>
           <w:vertAlign w:val="superscript"/>
+          <w:rtl/>
         </w:rPr>
         <w:t xml:space="preserve">رضي الله تعالى عنه</w:t>
       </w:r>
@@ -13503,6 +13729,7 @@
           <w:sz w:val="16"/>
           <w:szCs w:val="16"/>
           <w:vertAlign w:val="superscript"/>
+          <w:rtl/>
         </w:rPr>
         <w:t xml:space="preserve">رضي الله تعالى عنه</w:t>
       </w:r>
@@ -13560,6 +13787,7 @@
           <w:sz w:val="16"/>
           <w:szCs w:val="16"/>
           <w:vertAlign w:val="superscript"/>
+          <w:rtl/>
         </w:rPr>
         <w:t xml:space="preserve">رحمة الله تعالى عليهم</w:t>
       </w:r>
@@ -13735,6 +13963,7 @@
           <w:sz w:val="16"/>
           <w:szCs w:val="16"/>
           <w:vertAlign w:val="superscript"/>
+          <w:rtl/>
         </w:rPr>
         <w:t xml:space="preserve">رضي الله تعالى عنه</w:t>
       </w:r>
@@ -13751,6 +13980,7 @@
           <w:rFonts w:ascii="Noto Naskh Arabic" w:cs="Noto Naskh Arabic" w:eastAsia="Noto Naskh Arabic" w:hAnsi="Noto Naskh Arabic"/>
           <w:sz w:val="22"/>
           <w:szCs w:val="22"/>
+          <w:rtl/>
         </w:rPr>
         <w:t xml:space="preserve">ﷺ</w:t>
       </w:r>
@@ -13852,6 +14082,7 @@
           <w:sz w:val="16"/>
           <w:szCs w:val="16"/>
           <w:vertAlign w:val="superscript"/>
+          <w:rtl/>
         </w:rPr>
         <w:t xml:space="preserve">رضي الله تعالى عنه</w:t>
       </w:r>
@@ -13869,6 +14100,7 @@
           <w:sz w:val="16"/>
           <w:szCs w:val="16"/>
           <w:vertAlign w:val="superscript"/>
+          <w:rtl/>
         </w:rPr>
         <w:t xml:space="preserve">رضي الله تعالى عنه</w:t>
       </w:r>
@@ -13926,6 +14158,7 @@
           <w:sz w:val="16"/>
           <w:szCs w:val="16"/>
           <w:vertAlign w:val="superscript"/>
+          <w:rtl/>
         </w:rPr>
         <w:t xml:space="preserve">رضي الله تعالى عنهم</w:t>
       </w:r>
@@ -13956,6 +14189,7 @@
           <w:rFonts w:ascii="Noto Naskh Arabic" w:cs="Noto Naskh Arabic" w:eastAsia="Noto Naskh Arabic" w:hAnsi="Noto Naskh Arabic"/>
           <w:sz w:val="22"/>
           <w:szCs w:val="22"/>
+          <w:rtl/>
         </w:rPr>
         <w:t xml:space="preserve">ﷺ</w:t>
       </w:r>
@@ -13972,6 +14206,7 @@
           <w:rFonts w:ascii="Noto Naskh Arabic" w:cs="Noto Naskh Arabic" w:eastAsia="Noto Naskh Arabic" w:hAnsi="Noto Naskh Arabic"/>
           <w:sz w:val="22"/>
           <w:szCs w:val="22"/>
+          <w:rtl/>
         </w:rPr>
         <w:t xml:space="preserve">ﷺ</w:t>
       </w:r>
@@ -13988,6 +14223,7 @@
           <w:rFonts w:ascii="Noto Naskh Arabic" w:cs="Noto Naskh Arabic" w:eastAsia="Noto Naskh Arabic" w:hAnsi="Noto Naskh Arabic"/>
           <w:sz w:val="22"/>
           <w:szCs w:val="22"/>
+          <w:rtl/>
         </w:rPr>
         <w:t xml:space="preserve">ﷺ</w:t>
       </w:r>
@@ -14019,6 +14255,7 @@
           <w:sz w:val="16"/>
           <w:szCs w:val="16"/>
           <w:vertAlign w:val="superscript"/>
+          <w:rtl/>
         </w:rPr>
         <w:t xml:space="preserve">رضي الله تعالى عنه</w:t>
       </w:r>
@@ -14065,6 +14302,7 @@
           <w:sz w:val="34"/>
           <w:szCs w:val="34"/>
           <w:vertAlign w:val="superscript"/>
+          <w:rtl/>
         </w:rPr>
         <w:t xml:space="preserve">عليه السلام</w:t>
       </w:r>
@@ -14099,6 +14337,7 @@
           <w:sz w:val="16"/>
           <w:szCs w:val="16"/>
           <w:vertAlign w:val="superscript"/>
+          <w:rtl/>
         </w:rPr>
         <w:t xml:space="preserve">عليه السلام</w:t>
       </w:r>
@@ -14129,6 +14368,7 @@
           <w:rFonts w:ascii="Noto Naskh Arabic" w:cs="Noto Naskh Arabic" w:eastAsia="Noto Naskh Arabic" w:hAnsi="Noto Naskh Arabic"/>
           <w:sz w:val="22"/>
           <w:szCs w:val="22"/>
+          <w:rtl/>
         </w:rPr>
         <w:t xml:space="preserve">ﷺ</w:t>
       </w:r>
@@ -14254,6 +14494,7 @@
           <w:sz w:val="16"/>
           <w:szCs w:val="16"/>
           <w:vertAlign w:val="superscript"/>
+          <w:rtl/>
         </w:rPr>
         <w:t xml:space="preserve">رحمة الله تعالى عليه</w:t>
       </w:r>
@@ -14309,6 +14550,7 @@
           <w:iCs/>
           <w:sz w:val="22"/>
           <w:szCs w:val="22"/>
+          <w:rtl/>
         </w:rPr>
         <w:t xml:space="preserve">ﷺ</w:t>
       </w:r>
@@ -14329,6 +14571,7 @@
           <w:iCs/>
           <w:sz w:val="22"/>
           <w:szCs w:val="22"/>
+          <w:rtl/>
         </w:rPr>
         <w:t xml:space="preserve">ﷺ</w:t>
       </w:r>
@@ -14349,6 +14592,7 @@
           <w:iCs/>
           <w:sz w:val="22"/>
           <w:szCs w:val="22"/>
+          <w:rtl/>
         </w:rPr>
         <w:t xml:space="preserve">ﷺ</w:t>
       </w:r>
@@ -14413,6 +14657,7 @@
           <w:rFonts w:ascii="Noto Naskh Arabic" w:cs="Noto Naskh Arabic" w:eastAsia="Noto Naskh Arabic" w:hAnsi="Noto Naskh Arabic"/>
           <w:sz w:val="22"/>
           <w:szCs w:val="22"/>
+          <w:rtl/>
         </w:rPr>
         <w:t xml:space="preserve">ﷺ</w:t>
       </w:r>
@@ -14430,6 +14675,7 @@
           <w:sz w:val="16"/>
           <w:szCs w:val="16"/>
           <w:vertAlign w:val="superscript"/>
+          <w:rtl/>
         </w:rPr>
         <w:t xml:space="preserve">رحمة الله تعالى عليهم</w:t>
       </w:r>
@@ -14446,6 +14692,7 @@
           <w:rFonts w:ascii="Noto Naskh Arabic" w:cs="Noto Naskh Arabic" w:eastAsia="Noto Naskh Arabic" w:hAnsi="Noto Naskh Arabic"/>
           <w:sz w:val="22"/>
           <w:szCs w:val="22"/>
+          <w:rtl/>
         </w:rPr>
         <w:t xml:space="preserve">ﷺ</w:t>
       </w:r>
@@ -14484,6 +14731,7 @@
           <w:rFonts w:ascii="Noto Naskh Arabic" w:cs="Noto Naskh Arabic" w:eastAsia="Noto Naskh Arabic" w:hAnsi="Noto Naskh Arabic"/>
           <w:sz w:val="22"/>
           <w:szCs w:val="22"/>
+          <w:rtl/>
         </w:rPr>
         <w:t xml:space="preserve">ﷺ</w:t>
       </w:r>
@@ -14500,6 +14748,7 @@
           <w:rFonts w:ascii="Noto Naskh Arabic" w:cs="Noto Naskh Arabic" w:eastAsia="Noto Naskh Arabic" w:hAnsi="Noto Naskh Arabic"/>
           <w:sz w:val="22"/>
           <w:szCs w:val="22"/>
+          <w:rtl/>
         </w:rPr>
         <w:t xml:space="preserve">ﷺ</w:t>
       </w:r>
@@ -14516,6 +14765,7 @@
           <w:rFonts w:ascii="Noto Naskh Arabic" w:cs="Noto Naskh Arabic" w:eastAsia="Noto Naskh Arabic" w:hAnsi="Noto Naskh Arabic"/>
           <w:sz w:val="22"/>
           <w:szCs w:val="22"/>
+          <w:rtl/>
         </w:rPr>
         <w:t xml:space="preserve">ﷺ</w:t>
       </w:r>
@@ -14532,6 +14782,7 @@
           <w:rFonts w:ascii="Noto Naskh Arabic" w:cs="Noto Naskh Arabic" w:eastAsia="Noto Naskh Arabic" w:hAnsi="Noto Naskh Arabic"/>
           <w:sz w:val="22"/>
           <w:szCs w:val="22"/>
+          <w:rtl/>
         </w:rPr>
         <w:t xml:space="preserve">ﷺ</w:t>
       </w:r>
@@ -14563,6 +14814,7 @@
           <w:sz w:val="16"/>
           <w:szCs w:val="16"/>
           <w:vertAlign w:val="superscript"/>
+          <w:rtl/>
         </w:rPr>
         <w:t xml:space="preserve">رحمة الله تعالى عليه</w:t>
       </w:r>
@@ -14579,6 +14831,7 @@
           <w:rFonts w:ascii="Noto Naskh Arabic" w:cs="Noto Naskh Arabic" w:eastAsia="Noto Naskh Arabic" w:hAnsi="Noto Naskh Arabic"/>
           <w:sz w:val="22"/>
           <w:szCs w:val="22"/>
+          <w:rtl/>
         </w:rPr>
         <w:t xml:space="preserve">ﷺ</w:t>
       </w:r>
@@ -14613,6 +14866,7 @@
           <w:rFonts w:ascii="Noto Naskh Arabic" w:cs="Noto Naskh Arabic" w:eastAsia="Noto Naskh Arabic" w:hAnsi="Noto Naskh Arabic"/>
           <w:sz w:val="22"/>
           <w:szCs w:val="22"/>
+          <w:rtl/>
         </w:rPr>
         <w:t xml:space="preserve">ﷺ</w:t>
       </w:r>
@@ -14629,6 +14883,7 @@
           <w:rFonts w:ascii="Noto Naskh Arabic" w:cs="Noto Naskh Arabic" w:eastAsia="Noto Naskh Arabic" w:hAnsi="Noto Naskh Arabic"/>
           <w:sz w:val="22"/>
           <w:szCs w:val="22"/>
+          <w:rtl/>
         </w:rPr>
         <w:t xml:space="preserve">ﷺ</w:t>
       </w:r>
@@ -14660,6 +14915,7 @@
           <w:sz w:val="16"/>
           <w:szCs w:val="16"/>
           <w:vertAlign w:val="superscript"/>
+          <w:rtl/>
         </w:rPr>
         <w:t xml:space="preserve">رحمة الله تعالى عليه</w:t>
       </w:r>
@@ -14676,6 +14932,7 @@
           <w:rFonts w:ascii="Noto Naskh Arabic" w:cs="Noto Naskh Arabic" w:eastAsia="Noto Naskh Arabic" w:hAnsi="Noto Naskh Arabic"/>
           <w:sz w:val="22"/>
           <w:szCs w:val="22"/>
+          <w:rtl/>
         </w:rPr>
         <w:t xml:space="preserve">ﷺ</w:t>
       </w:r>
@@ -14715,6 +14972,7 @@
           <w:iCs/>
           <w:sz w:val="22"/>
           <w:szCs w:val="22"/>
+          <w:rtl/>
         </w:rPr>
         <w:t xml:space="preserve">"وعلمها النبي"</w:t>
       </w:r>
@@ -14761,6 +15019,7 @@
           <w:rFonts w:ascii="Noto Naskh Arabic" w:cs="Noto Naskh Arabic" w:eastAsia="Noto Naskh Arabic" w:hAnsi="Noto Naskh Arabic"/>
           <w:sz w:val="22"/>
           <w:szCs w:val="22"/>
+          <w:rtl/>
         </w:rPr>
         <w:t xml:space="preserve">ﷺ</w:t>
       </w:r>
@@ -14778,6 +15037,7 @@
           <w:sz w:val="16"/>
           <w:szCs w:val="16"/>
           <w:vertAlign w:val="superscript"/>
+          <w:rtl/>
         </w:rPr>
         <w:t xml:space="preserve">رحمة الله تعالى عليهم</w:t>
       </w:r>
@@ -14849,6 +15109,7 @@
           <w:sz w:val="16"/>
           <w:szCs w:val="16"/>
           <w:vertAlign w:val="superscript"/>
+          <w:rtl/>
         </w:rPr>
         <w:t xml:space="preserve">رحمة الله تعالى عليه</w:t>
       </w:r>
@@ -14924,6 +15185,7 @@
           <w:sz w:val="16"/>
           <w:szCs w:val="16"/>
           <w:vertAlign w:val="superscript"/>
+          <w:rtl/>
         </w:rPr>
         <w:t xml:space="preserve">رضي الله تعالى عنه</w:t>
       </w:r>
@@ -14953,6 +15215,7 @@
           <w:iCs/>
           <w:sz w:val="22"/>
           <w:szCs w:val="22"/>
+          <w:rtl/>
         </w:rPr>
         <w:t xml:space="preserve">"عيني في اللوح المحفوظ"</w:t>
       </w:r>
@@ -15000,6 +15263,7 @@
           <w:sz w:val="16"/>
           <w:szCs w:val="16"/>
           <w:vertAlign w:val="superscript"/>
+          <w:rtl/>
         </w:rPr>
         <w:t xml:space="preserve">عليه السلام</w:t>
       </w:r>
@@ -15030,6 +15294,7 @@
           <w:rFonts w:ascii="Noto Naskh Arabic" w:cs="Noto Naskh Arabic" w:eastAsia="Noto Naskh Arabic" w:hAnsi="Noto Naskh Arabic"/>
           <w:sz w:val="22"/>
           <w:szCs w:val="22"/>
+          <w:rtl/>
         </w:rPr>
         <w:t xml:space="preserve">ﷺ</w:t>
       </w:r>
@@ -15046,6 +15311,7 @@
           <w:rFonts w:ascii="Noto Naskh Arabic" w:cs="Noto Naskh Arabic" w:eastAsia="Noto Naskh Arabic" w:hAnsi="Noto Naskh Arabic"/>
           <w:sz w:val="22"/>
           <w:szCs w:val="22"/>
+          <w:rtl/>
         </w:rPr>
         <w:t xml:space="preserve">ﷺ</w:t>
       </w:r>
@@ -15081,6 +15347,7 @@
           <w:sz w:val="16"/>
           <w:szCs w:val="16"/>
           <w:vertAlign w:val="superscript"/>
+          <w:rtl/>
         </w:rPr>
         <w:t xml:space="preserve">رضي الله تعالى عنه</w:t>
       </w:r>
@@ -15097,6 +15364,7 @@
           <w:rFonts w:ascii="Noto Naskh Arabic" w:cs="Noto Naskh Arabic" w:eastAsia="Noto Naskh Arabic" w:hAnsi="Noto Naskh Arabic"/>
           <w:sz w:val="22"/>
           <w:szCs w:val="22"/>
+          <w:rtl/>
         </w:rPr>
         <w:t xml:space="preserve">ﷺ</w:t>
       </w:r>
@@ -15204,6 +15472,7 @@
           <w:sz w:val="16"/>
           <w:szCs w:val="16"/>
           <w:vertAlign w:val="superscript"/>
+          <w:rtl/>
         </w:rPr>
         <w:t xml:space="preserve">عليهم السلام</w:t>
       </w:r>
@@ -15285,6 +15554,7 @@
           <w:sz w:val="16"/>
           <w:szCs w:val="16"/>
           <w:vertAlign w:val="superscript"/>
+          <w:rtl/>
         </w:rPr>
         <w:t xml:space="preserve">قدس سره</w:t>
       </w:r>
@@ -15319,6 +15589,7 @@
           <w:rFonts w:ascii="Noto Naskh Arabic" w:cs="Noto Naskh Arabic" w:eastAsia="Noto Naskh Arabic" w:hAnsi="Noto Naskh Arabic"/>
           <w:sz w:val="22"/>
           <w:szCs w:val="22"/>
+          <w:rtl/>
         </w:rPr>
         <w:t xml:space="preserve">ﷺ</w:t>
       </w:r>
@@ -15350,6 +15621,7 @@
           <w:sz w:val="16"/>
           <w:szCs w:val="16"/>
           <w:vertAlign w:val="superscript"/>
+          <w:rtl/>
         </w:rPr>
         <w:t xml:space="preserve">رحمة الله تعالى عليه</w:t>
       </w:r>
@@ -15402,6 +15674,7 @@
           <w:rFonts w:ascii="Noto Naskh Arabic" w:cs="Noto Naskh Arabic" w:eastAsia="Noto Naskh Arabic" w:hAnsi="Noto Naskh Arabic"/>
           <w:sz w:val="22"/>
           <w:szCs w:val="22"/>
+          <w:rtl/>
         </w:rPr>
         <w:t xml:space="preserve">ﷺ</w:t>
       </w:r>
@@ -15418,6 +15691,7 @@
           <w:rFonts w:ascii="Noto Naskh Arabic" w:cs="Noto Naskh Arabic" w:eastAsia="Noto Naskh Arabic" w:hAnsi="Noto Naskh Arabic"/>
           <w:sz w:val="22"/>
           <w:szCs w:val="22"/>
+          <w:rtl/>
         </w:rPr>
         <w:t xml:space="preserve">ﷺ</w:t>
       </w:r>
@@ -15434,6 +15708,7 @@
           <w:rFonts w:ascii="Noto Naskh Arabic" w:cs="Noto Naskh Arabic" w:eastAsia="Noto Naskh Arabic" w:hAnsi="Noto Naskh Arabic"/>
           <w:sz w:val="22"/>
           <w:szCs w:val="22"/>
+          <w:rtl/>
         </w:rPr>
         <w:t xml:space="preserve">ﷺ</w:t>
       </w:r>
@@ -15510,6 +15785,7 @@
           <w:rFonts w:ascii="Noto Naskh Arabic" w:cs="Noto Naskh Arabic" w:eastAsia="Noto Naskh Arabic" w:hAnsi="Noto Naskh Arabic"/>
           <w:sz w:val="22"/>
           <w:szCs w:val="22"/>
+          <w:rtl/>
         </w:rPr>
         <w:t xml:space="preserve">ﷺ</w:t>
       </w:r>
@@ -15518,6 +15794,7 @@
           <w:rFonts w:ascii="Georgia" w:cs="Georgia" w:eastAsia="Georgia" w:hAnsi="Georgia"/>
           <w:sz w:val="22"/>
           <w:szCs w:val="22"/>
+          <w:rtl/>
         </w:rPr>
         <w:t xml:space="preserve"> — "الأول والآخر والظاهر والباطن" (Al-Awwal wal-Aakhir waz-Zaahir wal-Baatin) — from the treatise </w:t>
       </w:r>
@@ -15528,6 +15805,7 @@
           <w:iCs/>
           <w:sz w:val="22"/>
           <w:szCs w:val="22"/>
+          <w:rtl/>
         </w:rPr>
         <w:t xml:space="preserve">"إعلام الأذكياء" (I'lam al-Adhkiya')</w:t>
       </w:r>
@@ -15545,6 +15823,7 @@
           <w:sz w:val="16"/>
           <w:szCs w:val="16"/>
           <w:vertAlign w:val="superscript"/>
+          <w:rtl/>
         </w:rPr>
         <w:t xml:space="preserve">رحمة الله تعالى عليه</w:t>
       </w:r>
@@ -15648,6 +15927,7 @@
           <w:iCs/>
           <w:sz w:val="22"/>
           <w:szCs w:val="22"/>
+          <w:rtl/>
         </w:rPr>
         <w:t xml:space="preserve">"إعلام الأذكياء" (I'lam al-Adhkiya')</w:t>
       </w:r>
@@ -15665,6 +15945,7 @@
           <w:sz w:val="16"/>
           <w:szCs w:val="16"/>
           <w:vertAlign w:val="superscript"/>
+          <w:rtl/>
         </w:rPr>
         <w:t xml:space="preserve">رحمة الله تعالى عليه</w:t>
       </w:r>
@@ -15692,6 +15973,7 @@
           <w:iCs/>
           <w:sz w:val="22"/>
           <w:szCs w:val="22"/>
+          <w:rtl/>
         </w:rPr>
         <w:t xml:space="preserve">وصلى الله على من هو الأول والآخر والظاهر والباطن وهو بكل شيء عليم</w:t>
       </w:r>
@@ -15770,6 +16052,7 @@
           <w:rFonts w:ascii="Noto Naskh Arabic" w:cs="Noto Naskh Arabic" w:eastAsia="Noto Naskh Arabic" w:hAnsi="Noto Naskh Arabic"/>
           <w:sz w:val="22"/>
           <w:szCs w:val="22"/>
+          <w:rtl/>
         </w:rPr>
         <w:t xml:space="preserve">ﷺ</w:t>
       </w:r>
@@ -16179,6 +16462,7 @@
           <w:rFonts w:ascii="Noto Naskh Arabic" w:cs="Noto Naskh Arabic" w:eastAsia="Noto Naskh Arabic" w:hAnsi="Noto Naskh Arabic"/>
           <w:sz w:val="22"/>
           <w:szCs w:val="22"/>
+          <w:rtl/>
         </w:rPr>
         <w:t xml:space="preserve">ﷺ</w:t>
       </w:r>
@@ -16224,6 +16508,7 @@
           <w:color w:val="1A4C7A"/>
           <w:sz w:val="34"/>
           <w:szCs w:val="34"/>
+          <w:rtl/>
         </w:rPr>
         <w:t xml:space="preserve">ﷺ</w:t>
       </w:r>
@@ -16258,6 +16543,7 @@
           <w:sz w:val="16"/>
           <w:szCs w:val="16"/>
           <w:vertAlign w:val="superscript"/>
+          <w:rtl/>
         </w:rPr>
         <w:t xml:space="preserve">رضي الله تعالى عنه</w:t>
       </w:r>
@@ -16274,6 +16560,7 @@
           <w:rFonts w:ascii="Noto Naskh Arabic" w:cs="Noto Naskh Arabic" w:eastAsia="Noto Naskh Arabic" w:hAnsi="Noto Naskh Arabic"/>
           <w:sz w:val="22"/>
           <w:szCs w:val="22"/>
+          <w:rtl/>
         </w:rPr>
         <w:t xml:space="preserve">ﷺ</w:t>
       </w:r>
@@ -16290,6 +16577,7 @@
           <w:rFonts w:ascii="Noto Naskh Arabic" w:cs="Noto Naskh Arabic" w:eastAsia="Noto Naskh Arabic" w:hAnsi="Noto Naskh Arabic"/>
           <w:sz w:val="22"/>
           <w:szCs w:val="22"/>
+          <w:rtl/>
         </w:rPr>
         <w:t xml:space="preserve">ﷺ</w:t>
       </w:r>
@@ -16342,6 +16630,7 @@
           <w:rFonts w:ascii="Noto Naskh Arabic" w:cs="Noto Naskh Arabic" w:eastAsia="Noto Naskh Arabic" w:hAnsi="Noto Naskh Arabic"/>
           <w:sz w:val="22"/>
           <w:szCs w:val="22"/>
+          <w:rtl/>
         </w:rPr>
         <w:t xml:space="preserve">ﷺ</w:t>
       </w:r>
@@ -16358,6 +16647,7 @@
           <w:rFonts w:ascii="Noto Naskh Arabic" w:cs="Noto Naskh Arabic" w:eastAsia="Noto Naskh Arabic" w:hAnsi="Noto Naskh Arabic"/>
           <w:sz w:val="22"/>
           <w:szCs w:val="22"/>
+          <w:rtl/>
         </w:rPr>
         <w:t xml:space="preserve">ﷺ</w:t>
       </w:r>
@@ -16388,6 +16678,7 @@
           <w:rFonts w:ascii="Noto Naskh Arabic" w:cs="Noto Naskh Arabic" w:eastAsia="Noto Naskh Arabic" w:hAnsi="Noto Naskh Arabic"/>
           <w:sz w:val="22"/>
           <w:szCs w:val="22"/>
+          <w:rtl/>
         </w:rPr>
         <w:t xml:space="preserve">ﷺ</w:t>
       </w:r>
@@ -16422,6 +16713,7 @@
           <w:rFonts w:ascii="Noto Naskh Arabic" w:cs="Noto Naskh Arabic" w:eastAsia="Noto Naskh Arabic" w:hAnsi="Noto Naskh Arabic"/>
           <w:sz w:val="22"/>
           <w:szCs w:val="22"/>
+          <w:rtl/>
         </w:rPr>
         <w:t xml:space="preserve">ﷺ</w:t>
       </w:r>
@@ -16438,6 +16730,7 @@
           <w:rFonts w:ascii="Noto Naskh Arabic" w:cs="Noto Naskh Arabic" w:eastAsia="Noto Naskh Arabic" w:hAnsi="Noto Naskh Arabic"/>
           <w:sz w:val="22"/>
           <w:szCs w:val="22"/>
+          <w:rtl/>
         </w:rPr>
         <w:t xml:space="preserve">ﷺ</w:t>
       </w:r>
@@ -16454,6 +16747,7 @@
           <w:rFonts w:ascii="Noto Naskh Arabic" w:cs="Noto Naskh Arabic" w:eastAsia="Noto Naskh Arabic" w:hAnsi="Noto Naskh Arabic"/>
           <w:sz w:val="22"/>
           <w:szCs w:val="22"/>
+          <w:rtl/>
         </w:rPr>
         <w:t xml:space="preserve">ﷺ</w:t>
       </w:r>
@@ -16499,6 +16793,7 @@
           <w:color w:val="1A4C7A"/>
           <w:sz w:val="34"/>
           <w:szCs w:val="34"/>
+          <w:rtl/>
         </w:rPr>
         <w:t xml:space="preserve">ﷺ</w:t>
       </w:r>
@@ -16521,6 +16816,7 @@
           <w:rFonts w:ascii="Noto Naskh Arabic" w:cs="Noto Naskh Arabic" w:eastAsia="Noto Naskh Arabic" w:hAnsi="Noto Naskh Arabic"/>
           <w:sz w:val="22"/>
           <w:szCs w:val="22"/>
+          <w:rtl/>
         </w:rPr>
         <w:t xml:space="preserve">ﷺ</w:t>
       </w:r>
@@ -16538,6 +16834,7 @@
           <w:sz w:val="16"/>
           <w:szCs w:val="16"/>
           <w:vertAlign w:val="superscript"/>
+          <w:rtl/>
         </w:rPr>
         <w:t xml:space="preserve">قدس سره</w:t>
       </w:r>
@@ -16590,6 +16887,7 @@
           <w:rFonts w:ascii="Noto Naskh Arabic" w:cs="Noto Naskh Arabic" w:eastAsia="Noto Naskh Arabic" w:hAnsi="Noto Naskh Arabic"/>
           <w:sz w:val="22"/>
           <w:szCs w:val="22"/>
+          <w:rtl/>
         </w:rPr>
         <w:t xml:space="preserve">ﷺ</w:t>
       </w:r>
@@ -16639,6 +16937,7 @@
           <w:sz w:val="16"/>
           <w:szCs w:val="16"/>
           <w:vertAlign w:val="superscript"/>
+          <w:rtl/>
         </w:rPr>
         <w:t xml:space="preserve">رضي الله تعالى عنه</w:t>
       </w:r>
@@ -16656,6 +16955,7 @@
           <w:sz w:val="16"/>
           <w:szCs w:val="16"/>
           <w:vertAlign w:val="superscript"/>
+          <w:rtl/>
         </w:rPr>
         <w:t xml:space="preserve">عليه السلام</w:t>
       </w:r>
@@ -16672,6 +16972,7 @@
           <w:rFonts w:ascii="Noto Naskh Arabic" w:cs="Noto Naskh Arabic" w:eastAsia="Noto Naskh Arabic" w:hAnsi="Noto Naskh Arabic"/>
           <w:sz w:val="22"/>
           <w:szCs w:val="22"/>
+          <w:rtl/>
         </w:rPr>
         <w:t xml:space="preserve">ﷺ</w:t>
       </w:r>
@@ -16721,6 +17022,7 @@
           <w:sz w:val="16"/>
           <w:szCs w:val="16"/>
           <w:vertAlign w:val="superscript"/>
+          <w:rtl/>
         </w:rPr>
         <w:t xml:space="preserve">رضي الله تعالى عنه</w:t>
       </w:r>
@@ -16737,6 +17039,7 @@
           <w:rFonts w:ascii="Noto Naskh Arabic" w:cs="Noto Naskh Arabic" w:eastAsia="Noto Naskh Arabic" w:hAnsi="Noto Naskh Arabic"/>
           <w:sz w:val="22"/>
           <w:szCs w:val="22"/>
+          <w:rtl/>
         </w:rPr>
         <w:t xml:space="preserve">ﷺ</w:t>
       </w:r>
@@ -16775,6 +17078,7 @@
           <w:sz w:val="16"/>
           <w:szCs w:val="16"/>
           <w:vertAlign w:val="superscript"/>
+          <w:rtl/>
         </w:rPr>
         <w:t xml:space="preserve">عليه السلام</w:t>
       </w:r>
@@ -16796,6 +17100,7 @@
           <w:sz w:val="16"/>
           <w:szCs w:val="16"/>
           <w:vertAlign w:val="superscript"/>
+          <w:rtl/>
         </w:rPr>
         <w:t xml:space="preserve">عليه السلام</w:t>
       </w:r>
@@ -16883,6 +17188,7 @@
           <w:sz w:val="16"/>
           <w:szCs w:val="16"/>
           <w:vertAlign w:val="superscript"/>
+          <w:rtl/>
         </w:rPr>
         <w:t xml:space="preserve">عليه السلام</w:t>
       </w:r>
@@ -16914,6 +17220,7 @@
           <w:sz w:val="16"/>
           <w:szCs w:val="16"/>
           <w:vertAlign w:val="superscript"/>
+          <w:rtl/>
         </w:rPr>
         <w:t xml:space="preserve">عليه السلام</w:t>
       </w:r>
@@ -16977,6 +17284,7 @@
           <w:color w:val="1A4C7A"/>
           <w:sz w:val="34"/>
           <w:szCs w:val="34"/>
+          <w:rtl/>
         </w:rPr>
         <w:t xml:space="preserve">ﷺ</w:t>
       </w:r>
@@ -17010,6 +17318,7 @@
           <w:rFonts w:ascii="Noto Naskh Arabic" w:cs="Noto Naskh Arabic" w:eastAsia="Noto Naskh Arabic" w:hAnsi="Noto Naskh Arabic"/>
           <w:sz w:val="22"/>
           <w:szCs w:val="22"/>
+          <w:rtl/>
         </w:rPr>
         <w:t xml:space="preserve">ﷺ</w:t>
       </w:r>
@@ -17041,6 +17350,7 @@
           <w:sz w:val="16"/>
           <w:szCs w:val="16"/>
           <w:vertAlign w:val="superscript"/>
+          <w:rtl/>
         </w:rPr>
         <w:t xml:space="preserve">رحمة الله تعالى عليه</w:t>
       </w:r>
@@ -17057,6 +17367,7 @@
           <w:rFonts w:ascii="Noto Naskh Arabic" w:cs="Noto Naskh Arabic" w:eastAsia="Noto Naskh Arabic" w:hAnsi="Noto Naskh Arabic"/>
           <w:sz w:val="22"/>
           <w:szCs w:val="22"/>
+          <w:rtl/>
         </w:rPr>
         <w:t xml:space="preserve">ﷺ</w:t>
       </w:r>
@@ -17125,6 +17436,7 @@
           <w:rFonts w:ascii="Noto Naskh Arabic" w:cs="Noto Naskh Arabic" w:eastAsia="Noto Naskh Arabic" w:hAnsi="Noto Naskh Arabic"/>
           <w:sz w:val="22"/>
           <w:szCs w:val="22"/>
+          <w:rtl/>
         </w:rPr>
         <w:t xml:space="preserve">ﷺ</w:t>
       </w:r>
@@ -17179,6 +17491,7 @@
           <w:rFonts w:ascii="Noto Naskh Arabic" w:cs="Noto Naskh Arabic" w:eastAsia="Noto Naskh Arabic" w:hAnsi="Noto Naskh Arabic"/>
           <w:sz w:val="22"/>
           <w:szCs w:val="22"/>
+          <w:rtl/>
         </w:rPr>
         <w:t xml:space="preserve">ﷺ</w:t>
       </w:r>
@@ -17231,6 +17544,7 @@
           <w:rFonts w:ascii="Noto Naskh Arabic" w:cs="Noto Naskh Arabic" w:eastAsia="Noto Naskh Arabic" w:hAnsi="Noto Naskh Arabic"/>
           <w:sz w:val="22"/>
           <w:szCs w:val="22"/>
+          <w:rtl/>
         </w:rPr>
         <w:t xml:space="preserve">ﷺ</w:t>
       </w:r>
@@ -17287,6 +17601,7 @@
           <w:rFonts w:ascii="Noto Naskh Arabic" w:cs="Noto Naskh Arabic" w:eastAsia="Noto Naskh Arabic" w:hAnsi="Noto Naskh Arabic"/>
           <w:sz w:val="22"/>
           <w:szCs w:val="22"/>
+          <w:rtl/>
         </w:rPr>
         <w:t xml:space="preserve">ﷺ</w:t>
       </w:r>
@@ -17317,6 +17632,7 @@
           <w:rFonts w:ascii="Noto Naskh Arabic" w:cs="Noto Naskh Arabic" w:eastAsia="Noto Naskh Arabic" w:hAnsi="Noto Naskh Arabic"/>
           <w:sz w:val="22"/>
           <w:szCs w:val="22"/>
+          <w:rtl/>
         </w:rPr>
         <w:t xml:space="preserve">ﷺ</w:t>
       </w:r>
@@ -17333,6 +17649,7 @@
           <w:rFonts w:ascii="Noto Naskh Arabic" w:cs="Noto Naskh Arabic" w:eastAsia="Noto Naskh Arabic" w:hAnsi="Noto Naskh Arabic"/>
           <w:sz w:val="22"/>
           <w:szCs w:val="22"/>
+          <w:rtl/>
         </w:rPr>
         <w:t xml:space="preserve">ﷺ</w:t>
       </w:r>
@@ -17657,6 +17974,7 @@
           <w:rFonts w:ascii="Noto Naskh Arabic" w:cs="Noto Naskh Arabic" w:eastAsia="Noto Naskh Arabic" w:hAnsi="Noto Naskh Arabic"/>
           <w:sz w:val="22"/>
           <w:szCs w:val="22"/>
+          <w:rtl/>
         </w:rPr>
         <w:t xml:space="preserve">ﷺ</w:t>
       </w:r>
@@ -17673,6 +17991,7 @@
           <w:rFonts w:ascii="Noto Naskh Arabic" w:cs="Noto Naskh Arabic" w:eastAsia="Noto Naskh Arabic" w:hAnsi="Noto Naskh Arabic"/>
           <w:sz w:val="22"/>
           <w:szCs w:val="22"/>
+          <w:rtl/>
         </w:rPr>
         <w:t xml:space="preserve">ﷺ</w:t>
       </w:r>
@@ -17704,6 +18023,7 @@
           <w:sz w:val="16"/>
           <w:szCs w:val="16"/>
           <w:vertAlign w:val="superscript"/>
+          <w:rtl/>
         </w:rPr>
         <w:t xml:space="preserve">رحمة الله تعالى عليه</w:t>
       </w:r>
@@ -17738,6 +18058,7 @@
           <w:rFonts w:ascii="Noto Naskh Arabic" w:cs="Noto Naskh Arabic" w:eastAsia="Noto Naskh Arabic" w:hAnsi="Noto Naskh Arabic"/>
           <w:sz w:val="22"/>
           <w:szCs w:val="22"/>
+          <w:rtl/>
         </w:rPr>
         <w:t xml:space="preserve">ﷺ</w:t>
       </w:r>
@@ -17769,6 +18090,7 @@
           <w:sz w:val="16"/>
           <w:szCs w:val="16"/>
           <w:vertAlign w:val="superscript"/>
+          <w:rtl/>
         </w:rPr>
         <w:t xml:space="preserve">قدس سره</w:t>
       </w:r>
@@ -17893,6 +18215,7 @@
           <w:rFonts w:ascii="Noto Naskh Arabic" w:cs="Noto Naskh Arabic" w:eastAsia="Noto Naskh Arabic" w:hAnsi="Noto Naskh Arabic"/>
           <w:sz w:val="22"/>
           <w:szCs w:val="22"/>
+          <w:rtl/>
         </w:rPr>
         <w:t xml:space="preserve">ﷺ</w:t>
       </w:r>
@@ -17977,6 +18300,7 @@
           <w:rFonts w:ascii="Noto Naskh Arabic" w:cs="Noto Naskh Arabic" w:eastAsia="Noto Naskh Arabic" w:hAnsi="Noto Naskh Arabic"/>
           <w:sz w:val="22"/>
           <w:szCs w:val="22"/>
+          <w:rtl/>
         </w:rPr>
         <w:t xml:space="preserve">ﷺ</w:t>
       </w:r>
@@ -17993,6 +18317,7 @@
           <w:rFonts w:ascii="Noto Naskh Arabic" w:cs="Noto Naskh Arabic" w:eastAsia="Noto Naskh Arabic" w:hAnsi="Noto Naskh Arabic"/>
           <w:sz w:val="22"/>
           <w:szCs w:val="22"/>
+          <w:rtl/>
         </w:rPr>
         <w:t xml:space="preserve">ﷺ</w:t>
       </w:r>
@@ -18009,6 +18334,7 @@
           <w:rFonts w:ascii="Noto Naskh Arabic" w:cs="Noto Naskh Arabic" w:eastAsia="Noto Naskh Arabic" w:hAnsi="Noto Naskh Arabic"/>
           <w:sz w:val="22"/>
           <w:szCs w:val="22"/>
+          <w:rtl/>
         </w:rPr>
         <w:t xml:space="preserve">ﷺ</w:t>
       </w:r>
@@ -18065,6 +18391,7 @@
           <w:rFonts w:ascii="Noto Naskh Arabic" w:cs="Noto Naskh Arabic" w:eastAsia="Noto Naskh Arabic" w:hAnsi="Noto Naskh Arabic"/>
           <w:sz w:val="22"/>
           <w:szCs w:val="22"/>
+          <w:rtl/>
         </w:rPr>
         <w:t xml:space="preserve">ﷺ</w:t>
       </w:r>
@@ -18081,6 +18408,7 @@
           <w:rFonts w:ascii="Noto Naskh Arabic" w:cs="Noto Naskh Arabic" w:eastAsia="Noto Naskh Arabic" w:hAnsi="Noto Naskh Arabic"/>
           <w:sz w:val="22"/>
           <w:szCs w:val="22"/>
+          <w:rtl/>
         </w:rPr>
         <w:t xml:space="preserve">ﷺ</w:t>
       </w:r>
@@ -18105,6 +18433,7 @@
           <w:iCs/>
           <w:sz w:val="22"/>
           <w:szCs w:val="22"/>
+          <w:rtl/>
         </w:rPr>
         <w:t xml:space="preserve">عليه من الصلوات أفضلها ومن التحيات أكملها</w:t>
       </w:r>
@@ -18135,6 +18464,7 @@
           <w:rFonts w:ascii="Noto Naskh Arabic" w:cs="Noto Naskh Arabic" w:eastAsia="Noto Naskh Arabic" w:hAnsi="Noto Naskh Arabic"/>
           <w:sz w:val="22"/>
           <w:szCs w:val="22"/>
+          <w:rtl/>
         </w:rPr>
         <w:t xml:space="preserve">ﷺ</w:t>
       </w:r>
@@ -18151,6 +18481,7 @@
           <w:rFonts w:ascii="Noto Naskh Arabic" w:cs="Noto Naskh Arabic" w:eastAsia="Noto Naskh Arabic" w:hAnsi="Noto Naskh Arabic"/>
           <w:sz w:val="22"/>
           <w:szCs w:val="22"/>
+          <w:rtl/>
         </w:rPr>
         <w:t xml:space="preserve">ﷺ</w:t>
       </w:r>
@@ -18225,6 +18556,7 @@
           <w:rFonts w:ascii="Noto Naskh Arabic" w:cs="Noto Naskh Arabic" w:eastAsia="Noto Naskh Arabic" w:hAnsi="Noto Naskh Arabic"/>
           <w:sz w:val="22"/>
           <w:szCs w:val="22"/>
+          <w:rtl/>
         </w:rPr>
         <w:t xml:space="preserve">ﷺ</w:t>
       </w:r>
@@ -18241,6 +18573,7 @@
           <w:rFonts w:ascii="Noto Naskh Arabic" w:cs="Noto Naskh Arabic" w:eastAsia="Noto Naskh Arabic" w:hAnsi="Noto Naskh Arabic"/>
           <w:sz w:val="22"/>
           <w:szCs w:val="22"/>
+          <w:rtl/>
         </w:rPr>
         <w:t xml:space="preserve">ﷺ</w:t>
       </w:r>
@@ -18289,6 +18622,7 @@
           <w:rFonts w:ascii="Noto Naskh Arabic" w:cs="Noto Naskh Arabic" w:eastAsia="Noto Naskh Arabic" w:hAnsi="Noto Naskh Arabic"/>
           <w:sz w:val="22"/>
           <w:szCs w:val="22"/>
+          <w:rtl/>
         </w:rPr>
         <w:t xml:space="preserve">ﷺ</w:t>
       </w:r>
@@ -18346,6 +18680,7 @@
           <w:sz w:val="16"/>
           <w:szCs w:val="16"/>
           <w:vertAlign w:val="superscript"/>
+          <w:rtl/>
         </w:rPr>
         <w:t xml:space="preserve">رحمة الله تعالى عليه</w:t>
       </w:r>
@@ -18382,6 +18717,7 @@
           <w:iCs/>
           <w:sz w:val="22"/>
           <w:szCs w:val="22"/>
+          <w:rtl/>
         </w:rPr>
         <w:t xml:space="preserve">يعلم ما بين أيديهم</w:t>
       </w:r>
@@ -18400,6 +18736,7 @@
           <w:iCs/>
           <w:sz w:val="22"/>
           <w:szCs w:val="22"/>
+          <w:rtl/>
         </w:rPr>
         <w:t xml:space="preserve">من ذا الذي يشفع عنده إلا بإذنه</w:t>
       </w:r>
@@ -18416,6 +18753,7 @@
           <w:rFonts w:ascii="Noto Naskh Arabic" w:cs="Noto Naskh Arabic" w:eastAsia="Noto Naskh Arabic" w:hAnsi="Noto Naskh Arabic"/>
           <w:sz w:val="22"/>
           <w:szCs w:val="22"/>
+          <w:rtl/>
         </w:rPr>
         <w:t xml:space="preserve">ﷺ</w:t>
       </w:r>
@@ -18466,6 +18804,7 @@
           <w:iCs/>
           <w:sz w:val="22"/>
           <w:szCs w:val="22"/>
+          <w:rtl/>
         </w:rPr>
         <w:t xml:space="preserve">يعلم</w:t>
       </w:r>
@@ -18482,6 +18821,7 @@
           <w:rFonts w:ascii="Noto Naskh Arabic" w:cs="Noto Naskh Arabic" w:eastAsia="Noto Naskh Arabic" w:hAnsi="Noto Naskh Arabic"/>
           <w:sz w:val="22"/>
           <w:szCs w:val="22"/>
+          <w:rtl/>
         </w:rPr>
         <w:t xml:space="preserve">ﷺ</w:t>
       </w:r>
@@ -18500,6 +18840,7 @@
           <w:iCs/>
           <w:sz w:val="22"/>
           <w:szCs w:val="22"/>
+          <w:rtl/>
         </w:rPr>
         <w:t xml:space="preserve">ما خلفهم</w:t>
       </w:r>
@@ -18518,6 +18859,7 @@
           <w:iCs/>
           <w:sz w:val="22"/>
           <w:szCs w:val="22"/>
+          <w:rtl/>
         </w:rPr>
         <w:t xml:space="preserve">إلا بما يشاء</w:t>
       </w:r>
@@ -18534,6 +18876,7 @@
           <w:rFonts w:ascii="Noto Naskh Arabic" w:cs="Noto Naskh Arabic" w:eastAsia="Noto Naskh Arabic" w:hAnsi="Noto Naskh Arabic"/>
           <w:sz w:val="22"/>
           <w:szCs w:val="22"/>
+          <w:rtl/>
         </w:rPr>
         <w:t xml:space="preserve">ﷺ</w:t>
       </w:r>
@@ -18552,6 +18895,7 @@
           <w:iCs/>
           <w:sz w:val="22"/>
           <w:szCs w:val="22"/>
+          <w:rtl/>
         </w:rPr>
         <w:t xml:space="preserve">وسع كرسيه السماوات والأرض</w:t>
       </w:r>
@@ -18570,6 +18914,7 @@
           <w:iCs/>
           <w:sz w:val="22"/>
           <w:szCs w:val="22"/>
+          <w:rtl/>
         </w:rPr>
         <w:t xml:space="preserve">ولا يؤوده حفظهما</w:t>
       </w:r>
@@ -18587,6 +18932,7 @@
           <w:sz w:val="16"/>
           <w:szCs w:val="16"/>
           <w:vertAlign w:val="superscript"/>
+          <w:rtl/>
         </w:rPr>
         <w:t xml:space="preserve">عليه السلام</w:t>
       </w:r>
@@ -18658,6 +19004,7 @@
           <w:sz w:val="16"/>
           <w:szCs w:val="16"/>
           <w:vertAlign w:val="superscript"/>
+          <w:rtl/>
         </w:rPr>
         <w:t xml:space="preserve">قدس سره</w:t>
       </w:r>
@@ -18676,6 +19023,7 @@
           <w:iCs/>
           <w:sz w:val="22"/>
           <w:szCs w:val="22"/>
+          <w:rtl/>
         </w:rPr>
         <w:t xml:space="preserve">من ذا الذي يشفع عنده إلا بإذنه</w:t>
       </w:r>
@@ -18692,6 +19040,7 @@
           <w:rFonts w:ascii="Noto Naskh Arabic" w:cs="Noto Naskh Arabic" w:eastAsia="Noto Naskh Arabic" w:hAnsi="Noto Naskh Arabic"/>
           <w:sz w:val="22"/>
           <w:szCs w:val="22"/>
+          <w:rtl/>
         </w:rPr>
         <w:t xml:space="preserve">ﷺ</w:t>
       </w:r>
@@ -18710,6 +19059,7 @@
           <w:iCs/>
           <w:sz w:val="22"/>
           <w:szCs w:val="22"/>
+          <w:rtl/>
         </w:rPr>
         <w:t xml:space="preserve">بإذنه</w:t>
       </w:r>
@@ -18778,6 +19128,7 @@
           <w:rFonts w:ascii="Noto Naskh Arabic" w:cs="Noto Naskh Arabic" w:eastAsia="Noto Naskh Arabic" w:hAnsi="Noto Naskh Arabic"/>
           <w:sz w:val="22"/>
           <w:szCs w:val="22"/>
+          <w:rtl/>
         </w:rPr>
         <w:t xml:space="preserve">ﷺ</w:t>
       </w:r>
@@ -18834,6 +19185,7 @@
           <w:rFonts w:ascii="Noto Naskh Arabic" w:cs="Noto Naskh Arabic" w:eastAsia="Noto Naskh Arabic" w:hAnsi="Noto Naskh Arabic"/>
           <w:sz w:val="22"/>
           <w:szCs w:val="22"/>
+          <w:rtl/>
         </w:rPr>
         <w:t xml:space="preserve">ﷺ</w:t>
       </w:r>
@@ -18852,6 +19204,7 @@
           <w:iCs/>
           <w:sz w:val="22"/>
           <w:szCs w:val="22"/>
+          <w:rtl/>
         </w:rPr>
         <w:t xml:space="preserve">يعلم ما بين أيديهم</w:t>
       </w:r>
@@ -18870,6 +19223,7 @@
           <w:iCs/>
           <w:sz w:val="22"/>
           <w:szCs w:val="22"/>
+          <w:rtl/>
         </w:rPr>
         <w:t xml:space="preserve">ما كان</w:t>
       </w:r>
@@ -18888,6 +19242,7 @@
           <w:iCs/>
           <w:sz w:val="22"/>
           <w:szCs w:val="22"/>
+          <w:rtl/>
         </w:rPr>
         <w:t xml:space="preserve">ما يكون</w:t>
       </w:r>
@@ -18918,6 +19273,7 @@
           <w:rFonts w:ascii="Noto Naskh Arabic" w:cs="Noto Naskh Arabic" w:eastAsia="Noto Naskh Arabic" w:hAnsi="Noto Naskh Arabic"/>
           <w:sz w:val="22"/>
           <w:szCs w:val="22"/>
+          <w:rtl/>
         </w:rPr>
         <w:t xml:space="preserve">ﷺ</w:t>
       </w:r>
@@ -18934,6 +19290,7 @@
           <w:rFonts w:ascii="Noto Naskh Arabic" w:cs="Noto Naskh Arabic" w:eastAsia="Noto Naskh Arabic" w:hAnsi="Noto Naskh Arabic"/>
           <w:sz w:val="22"/>
           <w:szCs w:val="22"/>
+          <w:rtl/>
         </w:rPr>
         <w:t xml:space="preserve">ﷺ</w:t>
       </w:r>
@@ -18952,6 +19309,7 @@
           <w:iCs/>
           <w:sz w:val="22"/>
           <w:szCs w:val="22"/>
+          <w:rtl/>
         </w:rPr>
         <w:t xml:space="preserve">ولا يحيطون بشيء من علمه</w:t>
       </w:r>
@@ -18982,6 +19340,7 @@
           <w:rFonts w:ascii="Noto Naskh Arabic" w:cs="Noto Naskh Arabic" w:eastAsia="Noto Naskh Arabic" w:hAnsi="Noto Naskh Arabic"/>
           <w:sz w:val="22"/>
           <w:szCs w:val="22"/>
+          <w:rtl/>
         </w:rPr>
         <w:t xml:space="preserve">ﷺ</w:t>
       </w:r>
@@ -18998,6 +19357,7 @@
           <w:rFonts w:ascii="Noto Naskh Arabic" w:cs="Noto Naskh Arabic" w:eastAsia="Noto Naskh Arabic" w:hAnsi="Noto Naskh Arabic"/>
           <w:sz w:val="22"/>
           <w:szCs w:val="22"/>
+          <w:rtl/>
         </w:rPr>
         <w:t xml:space="preserve">ﷺ</w:t>
       </w:r>
@@ -19054,6 +19414,7 @@
           <w:rFonts w:ascii="Noto Naskh Arabic" w:cs="Noto Naskh Arabic" w:eastAsia="Noto Naskh Arabic" w:hAnsi="Noto Naskh Arabic"/>
           <w:sz w:val="22"/>
           <w:szCs w:val="22"/>
+          <w:rtl/>
         </w:rPr>
         <w:t xml:space="preserve">ﷺ</w:t>
       </w:r>
@@ -19070,6 +19431,7 @@
           <w:rFonts w:ascii="Noto Naskh Arabic" w:cs="Noto Naskh Arabic" w:eastAsia="Noto Naskh Arabic" w:hAnsi="Noto Naskh Arabic"/>
           <w:sz w:val="22"/>
           <w:szCs w:val="22"/>
+          <w:rtl/>
         </w:rPr>
         <w:t xml:space="preserve">ﷺ</w:t>
       </w:r>
@@ -19088,6 +19450,7 @@
           <w:iCs/>
           <w:sz w:val="22"/>
           <w:szCs w:val="22"/>
+          <w:rtl/>
         </w:rPr>
         <w:t xml:space="preserve">وسع كرسيه السماوات والأرض</w:t>
       </w:r>
@@ -19104,6 +19467,7 @@
           <w:rFonts w:ascii="Noto Naskh Arabic" w:cs="Noto Naskh Arabic" w:eastAsia="Noto Naskh Arabic" w:hAnsi="Noto Naskh Arabic"/>
           <w:sz w:val="22"/>
           <w:szCs w:val="22"/>
+          <w:rtl/>
         </w:rPr>
         <w:t xml:space="preserve">ﷺ</w:t>
       </w:r>
@@ -19166,6 +19530,7 @@
           <w:rFonts w:ascii="Noto Naskh Arabic" w:cs="Noto Naskh Arabic" w:eastAsia="Noto Naskh Arabic" w:hAnsi="Noto Naskh Arabic"/>
           <w:sz w:val="22"/>
           <w:szCs w:val="22"/>
+          <w:rtl/>
         </w:rPr>
         <w:t xml:space="preserve">ﷺ</w:t>
       </w:r>
@@ -19240,6 +19605,7 @@
           <w:sz w:val="16"/>
           <w:szCs w:val="16"/>
           <w:vertAlign w:val="superscript"/>
+          <w:rtl/>
         </w:rPr>
         <w:t xml:space="preserve">رحمة الله تعالى عليه</w:t>
       </w:r>
@@ -19304,6 +19670,7 @@
           <w:sz w:val="16"/>
           <w:szCs w:val="16"/>
           <w:vertAlign w:val="superscript"/>
+          <w:rtl/>
         </w:rPr>
         <w:t xml:space="preserve">رحمة الله تعالى عليه</w:t>
       </w:r>
@@ -19392,6 +19759,7 @@
           <w:iCs/>
           <w:sz w:val="22"/>
           <w:szCs w:val="22"/>
+          <w:rtl/>
         </w:rPr>
         <w:t xml:space="preserve">رتاہ</w:t>
       </w:r>
@@ -19424,6 +19792,7 @@
           <w:iCs/>
           <w:sz w:val="22"/>
           <w:szCs w:val="22"/>
+          <w:rtl/>
         </w:rPr>
         <w:t xml:space="preserve">رتاہ</w:t>
       </w:r>
@@ -19460,6 +19829,7 @@
           <w:iCs/>
           <w:sz w:val="22"/>
           <w:szCs w:val="22"/>
+          <w:rtl/>
         </w:rPr>
         <w:t xml:space="preserve">فإنه يراك</w:t>
       </w:r>
@@ -19491,6 +19861,7 @@
           <w:sz w:val="16"/>
           <w:szCs w:val="16"/>
           <w:vertAlign w:val="superscript"/>
+          <w:rtl/>
         </w:rPr>
         <w:t xml:space="preserve">رحمة الله تعالى عليه</w:t>
       </w:r>
@@ -19527,6 +19898,7 @@
           <w:iCs/>
           <w:sz w:val="22"/>
           <w:szCs w:val="22"/>
+          <w:rtl/>
         </w:rPr>
         <w:t xml:space="preserve">أرسله معنا غداً يرتع ويلعب</w:t>
       </w:r>
@@ -19545,6 +19917,7 @@
           <w:iCs/>
           <w:sz w:val="22"/>
           <w:szCs w:val="22"/>
+          <w:rtl/>
         </w:rPr>
         <w:t xml:space="preserve">ومن يتق ويصبر</w:t>
       </w:r>
@@ -19613,6 +19986,7 @@
           <w:iCs/>
           <w:sz w:val="22"/>
           <w:szCs w:val="22"/>
+          <w:rtl/>
         </w:rPr>
         <w:t xml:space="preserve">فإنه يراك</w:t>
       </w:r>
@@ -19644,6 +20018,7 @@
           <w:sz w:val="16"/>
           <w:szCs w:val="16"/>
           <w:vertAlign w:val="superscript"/>
+          <w:rtl/>
         </w:rPr>
         <w:t xml:space="preserve">رحمة الله تعالى عليه</w:t>
       </w:r>
@@ -19680,6 +20055,7 @@
           <w:iCs/>
           <w:sz w:val="22"/>
           <w:szCs w:val="22"/>
+          <w:rtl/>
         </w:rPr>
         <w:t xml:space="preserve">فإنه يراك</w:t>
       </w:r>
@@ -19712,6 +20088,7 @@
           <w:iCs/>
           <w:sz w:val="22"/>
           <w:szCs w:val="22"/>
+          <w:rtl/>
         </w:rPr>
         <w:t xml:space="preserve">فإنه يراك</w:t>
       </w:r>
@@ -19730,6 +20107,7 @@
           <w:iCs/>
           <w:sz w:val="22"/>
           <w:szCs w:val="22"/>
+          <w:rtl/>
         </w:rPr>
         <w:t xml:space="preserve">فإن لم تكن</w:t>
       </w:r>
@@ -19748,6 +20126,7 @@
           <w:iCs/>
           <w:sz w:val="22"/>
           <w:szCs w:val="22"/>
+          <w:rtl/>
         </w:rPr>
         <w:t xml:space="preserve">رتاہ</w:t>
       </w:r>
@@ -19766,6 +20145,7 @@
           <w:iCs/>
           <w:sz w:val="22"/>
           <w:szCs w:val="22"/>
+          <w:rtl/>
         </w:rPr>
         <w:t xml:space="preserve">فإنه يراك</w:t>
       </w:r>
@@ -19816,6 +20196,7 @@
           <w:iCs/>
           <w:sz w:val="22"/>
           <w:szCs w:val="22"/>
+          <w:rtl/>
         </w:rPr>
         <w:t xml:space="preserve">فإن لم تكن</w:t>
       </w:r>
@@ -19834,6 +20215,7 @@
           <w:iCs/>
           <w:sz w:val="22"/>
           <w:szCs w:val="22"/>
+          <w:rtl/>
         </w:rPr>
         <w:t xml:space="preserve">فإنه يراك</w:t>
       </w:r>
@@ -19865,6 +20247,7 @@
           <w:sz w:val="16"/>
           <w:szCs w:val="16"/>
           <w:vertAlign w:val="superscript"/>
+          <w:rtl/>
         </w:rPr>
         <w:t xml:space="preserve">رحمة الله تعالى عليه</w:t>
       </w:r>
@@ -19992,6 +20375,7 @@
           <w:iCs/>
           <w:sz w:val="22"/>
           <w:szCs w:val="22"/>
+          <w:rtl/>
         </w:rPr>
         <w:t xml:space="preserve">ما زارني في النوم إلا خياله، فقلت له أهلاً وسهلاً ومرحبا</w:t>
       </w:r>
@@ -20047,6 +20431,7 @@
           <w:rFonts w:ascii="Noto Naskh Arabic" w:cs="Noto Naskh Arabic" w:eastAsia="Noto Naskh Arabic" w:hAnsi="Noto Naskh Arabic"/>
           <w:sz w:val="22"/>
           <w:szCs w:val="22"/>
+          <w:rtl/>
         </w:rPr>
         <w:t xml:space="preserve">ﷺ</w:t>
       </w:r>
@@ -20134,6 +20519,7 @@
           <w:rFonts w:ascii="Noto Naskh Arabic" w:cs="Noto Naskh Arabic" w:eastAsia="Noto Naskh Arabic" w:hAnsi="Noto Naskh Arabic"/>
           <w:sz w:val="22"/>
           <w:szCs w:val="22"/>
+          <w:rtl/>
         </w:rPr>
         <w:t xml:space="preserve">ﷺ</w:t>
       </w:r>
@@ -20204,6 +20590,7 @@
           <w:rFonts w:ascii="Noto Naskh Arabic" w:cs="Noto Naskh Arabic" w:eastAsia="Noto Naskh Arabic" w:hAnsi="Noto Naskh Arabic"/>
           <w:sz w:val="22"/>
           <w:szCs w:val="22"/>
+          <w:rtl/>
         </w:rPr>
         <w:t xml:space="preserve">ﷺ</w:t>
       </w:r>
@@ -20220,6 +20607,7 @@
           <w:rFonts w:ascii="Noto Naskh Arabic" w:cs="Noto Naskh Arabic" w:eastAsia="Noto Naskh Arabic" w:hAnsi="Noto Naskh Arabic"/>
           <w:sz w:val="22"/>
           <w:szCs w:val="22"/>
+          <w:rtl/>
         </w:rPr>
         <w:t xml:space="preserve">ﷺ</w:t>
       </w:r>
@@ -20256,6 +20644,7 @@
           <w:iCs/>
           <w:sz w:val="22"/>
           <w:szCs w:val="22"/>
+          <w:rtl/>
         </w:rPr>
         <w:t xml:space="preserve">ما لم تكن تعلم</w:t>
       </w:r>
@@ -20312,6 +20701,7 @@
           <w:rFonts w:ascii="Noto Naskh Arabic" w:cs="Noto Naskh Arabic" w:eastAsia="Noto Naskh Arabic" w:hAnsi="Noto Naskh Arabic"/>
           <w:sz w:val="22"/>
           <w:szCs w:val="22"/>
+          <w:rtl/>
         </w:rPr>
         <w:t xml:space="preserve">ﷺ</w:t>
       </w:r>
@@ -20328,6 +20718,7 @@
           <w:rFonts w:ascii="Noto Naskh Arabic" w:cs="Noto Naskh Arabic" w:eastAsia="Noto Naskh Arabic" w:hAnsi="Noto Naskh Arabic"/>
           <w:sz w:val="22"/>
           <w:szCs w:val="22"/>
+          <w:rtl/>
         </w:rPr>
         <w:t xml:space="preserve">ﷺ</w:t>
       </w:r>
@@ -20409,6 +20800,7 @@
           <w:sz w:val="16"/>
           <w:szCs w:val="16"/>
           <w:vertAlign w:val="superscript"/>
+          <w:rtl/>
         </w:rPr>
         <w:t xml:space="preserve">رحمة الله تعالى عليه</w:t>
       </w:r>
@@ -20529,6 +20921,7 @@
           <w:sz w:val="16"/>
           <w:szCs w:val="16"/>
           <w:vertAlign w:val="superscript"/>
+          <w:rtl/>
         </w:rPr>
         <w:t xml:space="preserve">قدس سره</w:t>
       </w:r>
@@ -20664,6 +21057,7 @@
           <w:sz w:val="16"/>
           <w:szCs w:val="16"/>
           <w:vertAlign w:val="superscript"/>
+          <w:rtl/>
         </w:rPr>
         <w:t xml:space="preserve">رحمة الله تعالى عليه</w:t>
       </w:r>
@@ -20699,6 +21093,7 @@
           <w:sz w:val="16"/>
           <w:szCs w:val="16"/>
           <w:vertAlign w:val="superscript"/>
+          <w:rtl/>
         </w:rPr>
         <w:t xml:space="preserve">رحمة الله تعالى عليه</w:t>
       </w:r>
@@ -20766,6 +21161,7 @@
           <w:sz w:val="16"/>
           <w:szCs w:val="16"/>
           <w:vertAlign w:val="superscript"/>
+          <w:rtl/>
         </w:rPr>
         <w:t xml:space="preserve">قدس سره</w:t>
       </w:r>
@@ -20782,6 +21178,7 @@
           <w:rFonts w:ascii="Noto Naskh Arabic" w:cs="Noto Naskh Arabic" w:eastAsia="Noto Naskh Arabic" w:hAnsi="Noto Naskh Arabic"/>
           <w:sz w:val="22"/>
           <w:szCs w:val="22"/>
+          <w:rtl/>
         </w:rPr>
         <w:t xml:space="preserve">ﷺ</w:t>
       </w:r>
@@ -20838,6 +21235,7 @@
           <w:iCs/>
           <w:sz w:val="22"/>
           <w:szCs w:val="22"/>
+          <w:rtl/>
         </w:rPr>
         <w:t xml:space="preserve">ﷺ</w:t>
       </w:r>
@@ -20870,6 +21268,7 @@
           <w:rFonts w:ascii="Noto Naskh Arabic" w:cs="Noto Naskh Arabic" w:eastAsia="Noto Naskh Arabic" w:hAnsi="Noto Naskh Arabic"/>
           <w:sz w:val="22"/>
           <w:szCs w:val="22"/>
+          <w:rtl/>
         </w:rPr>
         <w:t xml:space="preserve">ﷺ</w:t>
       </w:r>
@@ -20900,6 +21299,7 @@
           <w:rFonts w:ascii="Noto Naskh Arabic" w:cs="Noto Naskh Arabic" w:eastAsia="Noto Naskh Arabic" w:hAnsi="Noto Naskh Arabic"/>
           <w:sz w:val="22"/>
           <w:szCs w:val="22"/>
+          <w:rtl/>
         </w:rPr>
         <w:t xml:space="preserve">ﷺ</w:t>
       </w:r>
@@ -21006,6 +21406,7 @@
           <w:rFonts w:ascii="Noto Naskh Arabic" w:cs="Noto Naskh Arabic" w:eastAsia="Noto Naskh Arabic" w:hAnsi="Noto Naskh Arabic"/>
           <w:sz w:val="22"/>
           <w:szCs w:val="22"/>
+          <w:rtl/>
         </w:rPr>
         <w:t xml:space="preserve">ﷺ</w:t>
       </w:r>
@@ -21189,6 +21590,7 @@
           <w:rFonts w:ascii="Noto Naskh Arabic" w:cs="Noto Naskh Arabic" w:eastAsia="Noto Naskh Arabic" w:hAnsi="Noto Naskh Arabic"/>
           <w:sz w:val="22"/>
           <w:szCs w:val="22"/>
+          <w:rtl/>
         </w:rPr>
         <w:t xml:space="preserve">ﷺ</w:t>
       </w:r>
@@ -21205,6 +21607,7 @@
           <w:rFonts w:ascii="Noto Naskh Arabic" w:cs="Noto Naskh Arabic" w:eastAsia="Noto Naskh Arabic" w:hAnsi="Noto Naskh Arabic"/>
           <w:sz w:val="22"/>
           <w:szCs w:val="22"/>
+          <w:rtl/>
         </w:rPr>
         <w:t xml:space="preserve">ﷺ</w:t>
       </w:r>
@@ -21221,6 +21624,7 @@
           <w:rFonts w:ascii="Noto Naskh Arabic" w:cs="Noto Naskh Arabic" w:eastAsia="Noto Naskh Arabic" w:hAnsi="Noto Naskh Arabic"/>
           <w:sz w:val="22"/>
           <w:szCs w:val="22"/>
+          <w:rtl/>
         </w:rPr>
         <w:t xml:space="preserve">ﷺ</w:t>
       </w:r>
@@ -21239,6 +21643,7 @@
           <w:iCs/>
           <w:sz w:val="22"/>
           <w:szCs w:val="22"/>
+          <w:rtl/>
         </w:rPr>
         <w:t xml:space="preserve">تبياناً لكل شيء</w:t>
       </w:r>
@@ -21255,6 +21660,7 @@
           <w:rFonts w:ascii="Noto Naskh Arabic" w:cs="Noto Naskh Arabic" w:eastAsia="Noto Naskh Arabic" w:hAnsi="Noto Naskh Arabic"/>
           <w:sz w:val="22"/>
           <w:szCs w:val="22"/>
+          <w:rtl/>
         </w:rPr>
         <w:t xml:space="preserve">ﷺ</w:t>
       </w:r>
@@ -21285,6 +21691,7 @@
           <w:rFonts w:ascii="Noto Naskh Arabic" w:cs="Noto Naskh Arabic" w:eastAsia="Noto Naskh Arabic" w:hAnsi="Noto Naskh Arabic"/>
           <w:sz w:val="22"/>
           <w:szCs w:val="22"/>
+          <w:rtl/>
         </w:rPr>
         <w:t xml:space="preserve">ﷺ</w:t>
       </w:r>
@@ -21301,6 +21708,7 @@
           <w:rFonts w:ascii="Noto Naskh Arabic" w:cs="Noto Naskh Arabic" w:eastAsia="Noto Naskh Arabic" w:hAnsi="Noto Naskh Arabic"/>
           <w:sz w:val="22"/>
           <w:szCs w:val="22"/>
+          <w:rtl/>
         </w:rPr>
         <w:t xml:space="preserve">ﷺ</w:t>
       </w:r>
@@ -21317,6 +21725,7 @@
           <w:rFonts w:ascii="Noto Naskh Arabic" w:cs="Noto Naskh Arabic" w:eastAsia="Noto Naskh Arabic" w:hAnsi="Noto Naskh Arabic"/>
           <w:sz w:val="22"/>
           <w:szCs w:val="22"/>
+          <w:rtl/>
         </w:rPr>
         <w:t xml:space="preserve">ﷺ</w:t>
       </w:r>
@@ -21333,6 +21742,7 @@
           <w:rFonts w:ascii="Noto Naskh Arabic" w:cs="Noto Naskh Arabic" w:eastAsia="Noto Naskh Arabic" w:hAnsi="Noto Naskh Arabic"/>
           <w:sz w:val="22"/>
           <w:szCs w:val="22"/>
+          <w:rtl/>
         </w:rPr>
         <w:t xml:space="preserve">ﷺ</w:t>
       </w:r>
@@ -21349,6 +21759,7 @@
           <w:rFonts w:ascii="Noto Naskh Arabic" w:cs="Noto Naskh Arabic" w:eastAsia="Noto Naskh Arabic" w:hAnsi="Noto Naskh Arabic"/>
           <w:sz w:val="22"/>
           <w:szCs w:val="22"/>
+          <w:rtl/>
         </w:rPr>
         <w:t xml:space="preserve">ﷺ</w:t>
       </w:r>
@@ -21365,6 +21776,7 @@
           <w:rFonts w:ascii="Noto Naskh Arabic" w:cs="Noto Naskh Arabic" w:eastAsia="Noto Naskh Arabic" w:hAnsi="Noto Naskh Arabic"/>
           <w:sz w:val="22"/>
           <w:szCs w:val="22"/>
+          <w:rtl/>
         </w:rPr>
         <w:t xml:space="preserve">ﷺ</w:t>
       </w:r>
@@ -21395,6 +21807,7 @@
           <w:rFonts w:ascii="Noto Naskh Arabic" w:cs="Noto Naskh Arabic" w:eastAsia="Noto Naskh Arabic" w:hAnsi="Noto Naskh Arabic"/>
           <w:sz w:val="22"/>
           <w:szCs w:val="22"/>
+          <w:rtl/>
         </w:rPr>
         <w:t xml:space="preserve">ﷺ</w:t>
       </w:r>
@@ -21425,6 +21838,7 @@
           <w:rFonts w:ascii="Noto Naskh Arabic" w:cs="Noto Naskh Arabic" w:eastAsia="Noto Naskh Arabic" w:hAnsi="Noto Naskh Arabic"/>
           <w:sz w:val="22"/>
           <w:szCs w:val="22"/>
+          <w:rtl/>
         </w:rPr>
         <w:t xml:space="preserve">ﷺ</w:t>
       </w:r>
@@ -21481,6 +21895,7 @@
           <w:rFonts w:ascii="Noto Naskh Arabic" w:cs="Noto Naskh Arabic" w:eastAsia="Noto Naskh Arabic" w:hAnsi="Noto Naskh Arabic"/>
           <w:sz w:val="22"/>
           <w:szCs w:val="22"/>
+          <w:rtl/>
         </w:rPr>
         <w:t xml:space="preserve">ﷺ</w:t>
       </w:r>
@@ -21515,6 +21930,7 @@
           <w:rFonts w:ascii="Noto Naskh Arabic" w:cs="Noto Naskh Arabic" w:eastAsia="Noto Naskh Arabic" w:hAnsi="Noto Naskh Arabic"/>
           <w:sz w:val="22"/>
           <w:szCs w:val="22"/>
+          <w:rtl/>
         </w:rPr>
         <w:t xml:space="preserve">ﷺ</w:t>
       </w:r>
@@ -21531,6 +21947,7 @@
           <w:rFonts w:ascii="Noto Naskh Arabic" w:cs="Noto Naskh Arabic" w:eastAsia="Noto Naskh Arabic" w:hAnsi="Noto Naskh Arabic"/>
           <w:sz w:val="22"/>
           <w:szCs w:val="22"/>
+          <w:rtl/>
         </w:rPr>
         <w:t xml:space="preserve">ﷺ</w:t>
       </w:r>
@@ -21587,6 +22004,7 @@
           <w:rFonts w:ascii="Noto Naskh Arabic" w:cs="Noto Naskh Arabic" w:eastAsia="Noto Naskh Arabic" w:hAnsi="Noto Naskh Arabic"/>
           <w:sz w:val="22"/>
           <w:szCs w:val="22"/>
+          <w:rtl/>
         </w:rPr>
         <w:t xml:space="preserve">ﷺ</w:t>
       </w:r>
@@ -21603,6 +22021,7 @@
           <w:rFonts w:ascii="Noto Naskh Arabic" w:cs="Noto Naskh Arabic" w:eastAsia="Noto Naskh Arabic" w:hAnsi="Noto Naskh Arabic"/>
           <w:sz w:val="22"/>
           <w:szCs w:val="22"/>
+          <w:rtl/>
         </w:rPr>
         <w:t xml:space="preserve">ﷺ</w:t>
       </w:r>
@@ -21895,6 +22314,7 @@
           <w:iCs/>
           <w:sz w:val="22"/>
           <w:szCs w:val="22"/>
+          <w:rtl/>
         </w:rPr>
         <w:t xml:space="preserve">الحمد لله، ثم الجواب وظهر الصواب.</w:t>
       </w:r>
@@ -22052,6 +22472,7 @@
           <w:rFonts w:ascii="Georgia" w:cs="Georgia" w:eastAsia="Georgia" w:hAnsi="Georgia"/>
           <w:sz w:val="22"/>
           <w:szCs w:val="22"/>
+          <w:rtl/>
         </w:rPr>
         <w:t xml:space="preserve"> (أبد) — Post-eternity; endless future duration without termination. Used in discussions of knowledge spanning from pre-eternity to post-eternity (</w:t>
       </w:r>
@@ -22120,6 +22541,7 @@
           <w:rFonts w:ascii="Noto Naskh Arabic" w:cs="Noto Naskh Arabic" w:eastAsia="Noto Naskh Arabic" w:hAnsi="Noto Naskh Arabic"/>
           <w:sz w:val="22"/>
           <w:szCs w:val="22"/>
+          <w:rtl/>
         </w:rPr>
         <w:t xml:space="preserve">ﷺ</w:t>
       </w:r>
@@ -22152,6 +22574,7 @@
           <w:rFonts w:ascii="Georgia" w:cs="Georgia" w:eastAsia="Georgia" w:hAnsi="Georgia"/>
           <w:sz w:val="22"/>
           <w:szCs w:val="22"/>
+          <w:rtl/>
         </w:rPr>
         <w:t xml:space="preserve"> (عقيدة) — Creed; core beliefs of faith.</w:t>
       </w:r>
@@ -22176,6 +22599,7 @@
           <w:rFonts w:ascii="Georgia" w:cs="Georgia" w:eastAsia="Georgia" w:hAnsi="Georgia"/>
           <w:sz w:val="22"/>
           <w:szCs w:val="22"/>
+          <w:rtl/>
         </w:rPr>
         <w:t xml:space="preserve"> (عطائي) — Bestowed; granted by Allah as a gift. Used of knowledge (</w:t>
       </w:r>
@@ -22218,6 +22642,7 @@
           <w:rFonts w:ascii="Georgia" w:cs="Georgia" w:eastAsia="Georgia" w:hAnsi="Georgia"/>
           <w:sz w:val="22"/>
           <w:szCs w:val="22"/>
+          <w:rtl/>
         </w:rPr>
         <w:t xml:space="preserve"> (أزل) — Pre-eternity; beginningless time before creation.</w:t>
       </w:r>
@@ -22242,6 +22667,7 @@
           <w:rFonts w:ascii="Georgia" w:cs="Georgia" w:eastAsia="Georgia" w:hAnsi="Georgia"/>
           <w:sz w:val="22"/>
           <w:szCs w:val="22"/>
+          <w:rtl/>
         </w:rPr>
         <w:t xml:space="preserve"> (برزخ) — The intermediate state between death and the Day of Resurrection.</w:t>
       </w:r>
@@ -22266,6 +22692,7 @@
           <w:rFonts w:ascii="Georgia" w:cs="Georgia" w:eastAsia="Georgia" w:hAnsi="Georgia"/>
           <w:sz w:val="22"/>
           <w:szCs w:val="22"/>
+          <w:rtl/>
         </w:rPr>
         <w:t xml:space="preserve"> (بدعة) — Innovation in religious matters; a newly introduced practice not found in the Quran or Sunnah.</w:t>
       </w:r>
@@ -22290,6 +22717,7 @@
           <w:rFonts w:ascii="Georgia" w:cs="Georgia" w:eastAsia="Georgia" w:hAnsi="Georgia"/>
           <w:sz w:val="22"/>
           <w:szCs w:val="22"/>
+          <w:rtl/>
         </w:rPr>
         <w:t xml:space="preserve"> (فقه) — Islamic jurisprudence; the understanding and application of Shariah.</w:t>
       </w:r>
@@ -22314,6 +22742,7 @@
           <w:rFonts w:ascii="Georgia" w:cs="Georgia" w:eastAsia="Georgia" w:hAnsi="Georgia"/>
           <w:sz w:val="22"/>
           <w:szCs w:val="22"/>
+          <w:rtl/>
         </w:rPr>
         <w:t xml:space="preserve"> (غوث) — "The Supreme Helper"; a title of the highest-ranking saint in the spiritual hierarchy, most famously associated with Shaykh Muhiyyuddin Abdul Qadir Jilani.</w:t>
       </w:r>
@@ -22338,6 +22767,7 @@
           <w:rFonts w:ascii="Georgia" w:cs="Georgia" w:eastAsia="Georgia" w:hAnsi="Georgia"/>
           <w:sz w:val="22"/>
           <w:szCs w:val="22"/>
+          <w:rtl/>
         </w:rPr>
         <w:t xml:space="preserve"> (حديث) — A report of the sayings, actions, or approvals of the Prophet Muhammad </w:t>
       </w:r>
@@ -22346,6 +22776,7 @@
           <w:rFonts w:ascii="Noto Naskh Arabic" w:cs="Noto Naskh Arabic" w:eastAsia="Noto Naskh Arabic" w:hAnsi="Noto Naskh Arabic"/>
           <w:sz w:val="22"/>
           <w:szCs w:val="22"/>
+          <w:rtl/>
         </w:rPr>
         <w:t xml:space="preserve">ﷺ</w:t>
       </w:r>
@@ -22378,6 +22809,7 @@
           <w:rFonts w:ascii="Georgia" w:cs="Georgia" w:eastAsia="Georgia" w:hAnsi="Georgia"/>
           <w:sz w:val="22"/>
           <w:szCs w:val="22"/>
+          <w:rtl/>
         </w:rPr>
         <w:t xml:space="preserve"> (اجتهاد) — Independent legal reasoning by a qualified scholar to derive rulings from the Quran and Sunnah.</w:t>
       </w:r>
@@ -22402,6 +22834,7 @@
           <w:rFonts w:ascii="Georgia" w:cs="Georgia" w:eastAsia="Georgia" w:hAnsi="Georgia"/>
           <w:sz w:val="22"/>
           <w:szCs w:val="22"/>
+          <w:rtl/>
         </w:rPr>
         <w:t xml:space="preserve"> (علم) — Knowledge.</w:t>
       </w:r>
@@ -22426,6 +22859,7 @@
           <w:rFonts w:ascii="Georgia" w:cs="Georgia" w:eastAsia="Georgia" w:hAnsi="Georgia"/>
           <w:sz w:val="22"/>
           <w:szCs w:val="22"/>
+          <w:rtl/>
         </w:rPr>
         <w:t xml:space="preserve"> (علم عطائي) — Bestowed knowledge; knowledge granted by Allah to His servants as a gift, not possessed by their own essence.</w:t>
       </w:r>
@@ -22450,6 +22884,7 @@
           <w:rFonts w:ascii="Georgia" w:cs="Georgia" w:eastAsia="Georgia" w:hAnsi="Georgia"/>
           <w:sz w:val="22"/>
           <w:szCs w:val="22"/>
+          <w:rtl/>
         </w:rPr>
         <w:t xml:space="preserve"> (علم غیب) — Knowledge of the unseen; matters that are hidden from ordinary perception.</w:t>
       </w:r>
@@ -22474,6 +22909,7 @@
           <w:rFonts w:ascii="Georgia" w:cs="Georgia" w:eastAsia="Georgia" w:hAnsi="Georgia"/>
           <w:sz w:val="22"/>
           <w:szCs w:val="22"/>
+          <w:rtl/>
         </w:rPr>
         <w:t xml:space="preserve"> (علم ذاتی) — Essential knowledge; knowledge that is intrinsic to a being's essence. Used exclusively of Allah's knowledge.</w:t>
       </w:r>
@@ -22498,6 +22934,7 @@
           <w:rFonts w:ascii="Georgia" w:cs="Georgia" w:eastAsia="Georgia" w:hAnsi="Georgia"/>
           <w:sz w:val="22"/>
           <w:szCs w:val="22"/>
+          <w:rtl/>
         </w:rPr>
         <w:t xml:space="preserve"> (إيمان) — Faith; belief in Allah, His angels, books, messengers, the Last Day, and divine decree.</w:t>
       </w:r>
@@ -22522,6 +22959,7 @@
           <w:rFonts w:ascii="Georgia" w:cs="Georgia" w:eastAsia="Georgia" w:hAnsi="Georgia"/>
           <w:sz w:val="22"/>
           <w:szCs w:val="22"/>
+          <w:rtl/>
         </w:rPr>
         <w:t xml:space="preserve"> (كرامات) — Miracles or extraordinary acts performed by saints through Allah's permission, as distinct from the miracles (</w:t>
       </w:r>
@@ -22564,6 +23002,7 @@
           <w:rFonts w:ascii="Georgia" w:cs="Georgia" w:eastAsia="Georgia" w:hAnsi="Georgia"/>
           <w:sz w:val="22"/>
           <w:szCs w:val="22"/>
+          <w:rtl/>
         </w:rPr>
         <w:t xml:space="preserve"> (كفر) — Disbelief; rejection of faith in Allah and His messenger.</w:t>
       </w:r>
@@ -22588,6 +23027,7 @@
           <w:rFonts w:ascii="Georgia" w:cs="Georgia" w:eastAsia="Georgia" w:hAnsi="Georgia"/>
           <w:sz w:val="22"/>
           <w:szCs w:val="22"/>
+          <w:rtl/>
         </w:rPr>
         <w:t xml:space="preserve"> (لوح محفوظ) — The Preserved Tablet; the heavenly tablet upon which all divine decrees and knowledge are inscribed.</w:t>
       </w:r>
@@ -22612,6 +23052,7 @@
           <w:rFonts w:ascii="Georgia" w:cs="Georgia" w:eastAsia="Georgia" w:hAnsi="Georgia"/>
           <w:sz w:val="22"/>
           <w:szCs w:val="22"/>
+          <w:rtl/>
         </w:rPr>
         <w:t xml:space="preserve"> (لوح مبين) — The Clear Tablet; another name for the Preserved Tablet or the manifestation of divine knowledge.</w:t>
       </w:r>
@@ -22636,6 +23077,7 @@
           <w:rFonts w:ascii="Georgia" w:cs="Georgia" w:eastAsia="Georgia" w:hAnsi="Georgia"/>
           <w:sz w:val="22"/>
           <w:szCs w:val="22"/>
+          <w:rtl/>
         </w:rPr>
         <w:t xml:space="preserve"> (ما كان وما يكون) — "What has been and what will be"; a phrase referring to the totality of knowledge from the beginning to the end of time.</w:t>
       </w:r>
@@ -22660,6 +23102,7 @@
           <w:rFonts w:ascii="Georgia" w:cs="Georgia" w:eastAsia="Georgia" w:hAnsi="Georgia"/>
           <w:sz w:val="22"/>
           <w:szCs w:val="22"/>
+          <w:rtl/>
         </w:rPr>
         <w:t xml:space="preserve"> (ملكوت) — The angelic realm; the dominion of the heavens.</w:t>
       </w:r>
@@ -22684,6 +23127,7 @@
           <w:rFonts w:ascii="Georgia" w:cs="Georgia" w:eastAsia="Georgia" w:hAnsi="Georgia"/>
           <w:sz w:val="22"/>
           <w:szCs w:val="22"/>
+          <w:rtl/>
         </w:rPr>
         <w:t xml:space="preserve"> (معرفة) — Gnosis; direct experiential recognition of Allah through spiritual unveiling, distinct from academic knowledge (</w:t>
       </w:r>
@@ -22726,6 +23170,7 @@
           <w:rFonts w:ascii="Georgia" w:cs="Georgia" w:eastAsia="Georgia" w:hAnsi="Georgia"/>
           <w:sz w:val="22"/>
           <w:szCs w:val="22"/>
+          <w:rtl/>
         </w:rPr>
         <w:t xml:space="preserve"> (معجزة) — A miracle performed by a prophet as a sign of prophethood, by Allah's permission.</w:t>
       </w:r>
@@ -22750,6 +23195,7 @@
           <w:rFonts w:ascii="Georgia" w:cs="Georgia" w:eastAsia="Georgia" w:hAnsi="Georgia"/>
           <w:sz w:val="22"/>
           <w:szCs w:val="22"/>
+          <w:rtl/>
         </w:rPr>
         <w:t xml:space="preserve"> (مجتهد) — A scholar qualified to perform </w:t>
       </w:r>
@@ -22792,6 +23238,7 @@
           <w:rFonts w:ascii="Georgia" w:cs="Georgia" w:eastAsia="Georgia" w:hAnsi="Georgia"/>
           <w:sz w:val="22"/>
           <w:szCs w:val="22"/>
+          <w:rtl/>
         </w:rPr>
         <w:t xml:space="preserve"> (مشرك) — One who associates partners with Allah.</w:t>
       </w:r>
@@ -22816,6 +23263,7 @@
           <w:rFonts w:ascii="Georgia" w:cs="Georgia" w:eastAsia="Georgia" w:hAnsi="Georgia"/>
           <w:sz w:val="22"/>
           <w:szCs w:val="22"/>
+          <w:rtl/>
         </w:rPr>
         <w:t xml:space="preserve"> (متواتر) — A hadith transmitted by so many narrators at each level that collusion upon falsehood is inconceivable.</w:t>
       </w:r>
@@ -22840,6 +23288,7 @@
           <w:rFonts w:ascii="Georgia" w:cs="Georgia" w:eastAsia="Georgia" w:hAnsi="Georgia"/>
           <w:sz w:val="22"/>
           <w:szCs w:val="22"/>
+          <w:rtl/>
         </w:rPr>
         <w:t xml:space="preserve"> (نبوّة) — Prophethood; the station of being a prophet of Allah.</w:t>
       </w:r>
@@ -22864,6 +23313,7 @@
           <w:rFonts w:ascii="Georgia" w:cs="Georgia" w:eastAsia="Georgia" w:hAnsi="Georgia"/>
           <w:sz w:val="22"/>
           <w:szCs w:val="22"/>
+          <w:rtl/>
         </w:rPr>
         <w:t xml:space="preserve"> (قيامت) — The Day of Resurrection; the final day of judgment.</w:t>
       </w:r>
@@ -22888,6 +23338,7 @@
           <w:rFonts w:ascii="Georgia" w:cs="Georgia" w:eastAsia="Georgia" w:hAnsi="Georgia"/>
           <w:sz w:val="22"/>
           <w:szCs w:val="22"/>
+          <w:rtl/>
         </w:rPr>
         <w:t xml:space="preserve"> (قطب) — The "Pole" or spiritual axis; the highest-ranking saint of his age around whom the spiritual world revolves.</w:t>
       </w:r>
@@ -22912,6 +23363,7 @@
           <w:rFonts w:ascii="Georgia" w:cs="Georgia" w:eastAsia="Georgia" w:hAnsi="Georgia"/>
           <w:sz w:val="22"/>
           <w:szCs w:val="22"/>
+          <w:rtl/>
         </w:rPr>
         <w:t xml:space="preserve"> (رسالة) — Messengership; the station of being a messenger (</w:t>
       </w:r>
@@ -22954,6 +23406,7 @@
           <w:rFonts w:ascii="Georgia" w:cs="Georgia" w:eastAsia="Georgia" w:hAnsi="Georgia"/>
           <w:sz w:val="22"/>
           <w:szCs w:val="22"/>
+          <w:rtl/>
         </w:rPr>
         <w:t xml:space="preserve"> (شريعة) — Islamic law derived from the Quran and Sunnah.</w:t>
       </w:r>
@@ -22978,6 +23431,7 @@
           <w:rFonts w:ascii="Georgia" w:cs="Georgia" w:eastAsia="Georgia" w:hAnsi="Georgia"/>
           <w:sz w:val="22"/>
           <w:szCs w:val="22"/>
+          <w:rtl/>
         </w:rPr>
         <w:t xml:space="preserve"> (شرك) — Associating partners with Allah; the gravest sin in Islam.</w:t>
       </w:r>
@@ -23002,6 +23456,7 @@
           <w:rFonts w:ascii="Georgia" w:cs="Georgia" w:eastAsia="Georgia" w:hAnsi="Georgia"/>
           <w:sz w:val="22"/>
           <w:szCs w:val="22"/>
+          <w:rtl/>
         </w:rPr>
         <w:t xml:space="preserve"> (سنة) — The established practice and way of the Prophet Muhammad </w:t>
       </w:r>
@@ -23010,6 +23465,7 @@
           <w:rFonts w:ascii="Noto Naskh Arabic" w:cs="Noto Naskh Arabic" w:eastAsia="Noto Naskh Arabic" w:hAnsi="Noto Naskh Arabic"/>
           <w:sz w:val="22"/>
           <w:szCs w:val="22"/>
+          <w:rtl/>
         </w:rPr>
         <w:t xml:space="preserve">ﷺ</w:t>
       </w:r>
@@ -23042,6 +23498,7 @@
           <w:rFonts w:ascii="Georgia" w:cs="Georgia" w:eastAsia="Georgia" w:hAnsi="Georgia"/>
           <w:sz w:val="22"/>
           <w:szCs w:val="22"/>
+          <w:rtl/>
         </w:rPr>
         <w:t xml:space="preserve"> (تصوف) — Sufism; the inner, spiritual dimension of Islam focused on purifying the soul and attaining nearness to Allah.</w:t>
       </w:r>
@@ -23066,6 +23523,7 @@
           <w:rFonts w:ascii="Georgia" w:cs="Georgia" w:eastAsia="Georgia" w:hAnsi="Georgia"/>
           <w:sz w:val="22"/>
           <w:szCs w:val="22"/>
+          <w:rtl/>
         </w:rPr>
         <w:t xml:space="preserve"> (تواتر) — Mass transmission; the quality of a report being </w:t>
       </w:r>
@@ -23108,6 +23566,7 @@
           <w:rFonts w:ascii="Georgia" w:cs="Georgia" w:eastAsia="Georgia" w:hAnsi="Georgia"/>
           <w:sz w:val="22"/>
           <w:szCs w:val="22"/>
+          <w:rtl/>
         </w:rPr>
         <w:t xml:space="preserve"> (توحيد) — The oneness of Allah; the fundamental Islamic belief in the absolute unity of God.</w:t>
       </w:r>
@@ -23132,6 +23591,7 @@
           <w:rFonts w:ascii="Georgia" w:cs="Georgia" w:eastAsia="Georgia" w:hAnsi="Georgia"/>
           <w:sz w:val="22"/>
           <w:szCs w:val="22"/>
+          <w:rtl/>
         </w:rPr>
         <w:t xml:space="preserve"> (ولاية) — Sainthood; the station of being a friend of Allah (</w:t>
       </w:r>
@@ -23174,6 +23634,7 @@
           <w:rFonts w:ascii="Georgia" w:cs="Georgia" w:eastAsia="Georgia" w:hAnsi="Georgia"/>
           <w:sz w:val="22"/>
           <w:szCs w:val="22"/>
+          <w:rtl/>
         </w:rPr>
         <w:t xml:space="preserve"> (ذاتی) — Essential; pertaining to the essence of a being. Used of Allah's essential attributes and knowledge.</w:t>
       </w:r>
@@ -23198,6 +23659,7 @@
           <w:rFonts w:ascii="Georgia" w:cs="Georgia" w:eastAsia="Georgia" w:hAnsi="Georgia"/>
           <w:sz w:val="22"/>
           <w:szCs w:val="22"/>
+          <w:rtl/>
         </w:rPr>
         <w:t xml:space="preserve"> (ذات) — Essence; the being of a person. For Allah, the Divine Essence; for the Prophet </w:t>
       </w:r>
@@ -23206,6 +23668,7 @@
           <w:rFonts w:ascii="Noto Naskh Arabic" w:cs="Noto Naskh Arabic" w:eastAsia="Noto Naskh Arabic" w:hAnsi="Noto Naskh Arabic"/>
           <w:sz w:val="22"/>
           <w:szCs w:val="22"/>
+          <w:rtl/>
         </w:rPr>
         <w:t xml:space="preserve">ﷺ</w:t>
       </w:r>
@@ -25522,6 +25985,7 @@
           <w:rFonts w:ascii="Noto Naskh Arabic" w:cs="Noto Naskh Arabic" w:eastAsia="Noto Naskh Arabic" w:hAnsi="Noto Naskh Arabic"/>
           <w:sz w:val="22"/>
           <w:szCs w:val="22"/>
+          <w:rtl/>
         </w:rPr>
         <w:t xml:space="preserve">ﷺ</w:t>
       </w:r>
@@ -25724,6 +26188,7 @@
           <w:rFonts w:ascii="Noto Naskh Arabic" w:cs="Noto Naskh Arabic" w:eastAsia="Noto Naskh Arabic" w:hAnsi="Noto Naskh Arabic"/>
           <w:sz w:val="22"/>
           <w:szCs w:val="22"/>
+          <w:rtl/>
         </w:rPr>
         <w:t xml:space="preserve">ﷺ</w:t>
       </w:r>
@@ -25902,6 +26367,7 @@
           <w:rFonts w:ascii="Noto Naskh Arabic" w:cs="Noto Naskh Arabic" w:eastAsia="Noto Naskh Arabic" w:hAnsi="Noto Naskh Arabic"/>
           <w:sz w:val="22"/>
           <w:szCs w:val="22"/>
+          <w:rtl/>
         </w:rPr>
         <w:t xml:space="preserve">ﷺ</w:t>
       </w:r>
@@ -26746,6 +27212,7 @@
           <w:rFonts w:ascii="Noto Naskh Arabic" w:cs="Noto Naskh Arabic" w:eastAsia="Noto Naskh Arabic" w:hAnsi="Noto Naskh Arabic"/>
           <w:sz w:val="22"/>
           <w:szCs w:val="22"/>
+          <w:rtl/>
         </w:rPr>
         <w:t xml:space="preserve">ﷺ</w:t>
       </w:r>
@@ -26966,6 +27433,7 @@
           <w:rFonts w:ascii="Noto Naskh Arabic" w:cs="Noto Naskh Arabic" w:eastAsia="Noto Naskh Arabic" w:hAnsi="Noto Naskh Arabic"/>
           <w:sz w:val="22"/>
           <w:szCs w:val="22"/>
+          <w:rtl/>
         </w:rPr>
         <w:t xml:space="preserve">ﷺ</w:t>
       </w:r>
@@ -27006,6 +27474,7 @@
           <w:rFonts w:ascii="Noto Naskh Arabic" w:cs="Noto Naskh Arabic" w:eastAsia="Noto Naskh Arabic" w:hAnsi="Noto Naskh Arabic"/>
           <w:sz w:val="22"/>
           <w:szCs w:val="22"/>
+          <w:rtl/>
         </w:rPr>
         <w:t xml:space="preserve">ﷺ</w:t>
       </w:r>
@@ -27160,6 +27629,7 @@
           <w:rFonts w:ascii="Noto Naskh Arabic" w:cs="Noto Naskh Arabic" w:eastAsia="Noto Naskh Arabic" w:hAnsi="Noto Naskh Arabic"/>
           <w:sz w:val="22"/>
           <w:szCs w:val="22"/>
+          <w:rtl/>
         </w:rPr>
         <w:t xml:space="preserve">ﷺ</w:t>
       </w:r>
@@ -27314,6 +27784,7 @@
           <w:rFonts w:ascii="Noto Naskh Arabic" w:cs="Noto Naskh Arabic" w:eastAsia="Noto Naskh Arabic" w:hAnsi="Noto Naskh Arabic"/>
           <w:sz w:val="22"/>
           <w:szCs w:val="22"/>
+          <w:rtl/>
         </w:rPr>
         <w:t xml:space="preserve">ﷺ</w:t>
       </w:r>

</xml_diff>

<commit_message>
ikhteyrate mustafa english done
</commit_message>
<xml_diff>
--- a/publishing/addawatul-makkiyyah-english/exports/docx/addawatul-makkiyyah-english.docx
+++ b/publishing/addawatul-makkiyyah-english/exports/docx/addawatul-makkiyyah-english.docx
@@ -17,7 +17,7 @@
           <w:sz w:val="48"/>
           <w:szCs w:val="48"/>
         </w:rPr>
-        <w:t xml:space="preserve">Addawatul Makkiyyah</w:t>
+        <w:t xml:space="preserve">Addawlatul Makkiyyah</w:t>
       </w:r>
     </w:p>
     <w:p>
@@ -163,7 +163,7 @@
           <w:sz w:val="22"/>
           <w:szCs w:val="22"/>
         </w:rPr>
-        <w:t xml:space="preserve">Addawatul Makkiyyah</w:t>
+        <w:t xml:space="preserve">Addawlatul Makkiyyah</w:t>
       </w:r>
       <w:r>
         <w:rPr>
@@ -227,7 +227,7 @@
           <w:sz w:val="22"/>
           <w:szCs w:val="22"/>
         </w:rPr>
-        <w:t xml:space="preserve">(Addawatul Makkiyyah — Urdu, p. 240)</w:t>
+        <w:t xml:space="preserve">(Addawlatul Makkiyyah — Urdu, p. 240)</w:t>
       </w:r>
     </w:p>
     <w:p>

</xml_diff>